<commit_message>
test: replace bulky audit document fixture
</commit_message>
<xml_diff>
--- a/docs/Jarvis Architecture- Phase 3( and 3.5 preview.docx
+++ b/docs/Jarvis Architecture- Phase 3( and 3.5 preview.docx
@@ -10,7 +10,7 @@
     <w:p>
       <w:r>
         <w:pict w14:anchorId="1396EF81">
-          <v:rect id="_x0000_i1133" style="width:0;height:1.5pt" o:hralign="center" o:hrstd="t" o:hr="t" fillcolor="#a0a0a0" stroked="f"/>
+          <v:rect id="_x0000_i1025" style="width:0;height:1.5pt" o:hralign="center" o:hrstd="t" o:hr="t" fillcolor="#a0a0a0" stroked="f"/>
         </w:pict>
       </w:r>
     </w:p>
@@ -84,7 +84,7 @@
     <w:p>
       <w:r>
         <w:pict w14:anchorId="206EF3FE">
-          <v:rect id="_x0000_i1134" style="width:0;height:1.5pt" o:hralign="center" o:hrstd="t" o:hr="t" fillcolor="#a0a0a0" stroked="f"/>
+          <v:rect id="_x0000_i1026" style="width:0;height:1.5pt" o:hralign="center" o:hrstd="t" o:hr="t" fillcolor="#a0a0a0" stroked="f"/>
         </w:pict>
       </w:r>
     </w:p>
@@ -131,7 +131,7 @@
     <w:p>
       <w:r>
         <w:pict w14:anchorId="5B931FBA">
-          <v:rect id="_x0000_i1135" style="width:0;height:1.5pt" o:hralign="center" o:hrstd="t" o:hr="t" fillcolor="#a0a0a0" stroked="f"/>
+          <v:rect id="_x0000_i1027" style="width:0;height:1.5pt" o:hralign="center" o:hrstd="t" o:hr="t" fillcolor="#a0a0a0" stroked="f"/>
         </w:pict>
       </w:r>
     </w:p>
@@ -934,7 +934,7 @@
     <w:p>
       <w:r>
         <w:pict w14:anchorId="36351536">
-          <v:rect id="_x0000_i1136" style="width:0;height:1.5pt" o:hralign="center" o:hrstd="t" o:hr="t" fillcolor="#a0a0a0" stroked="f"/>
+          <v:rect id="_x0000_i1028" style="width:0;height:1.5pt" o:hralign="center" o:hrstd="t" o:hr="t" fillcolor="#a0a0a0" stroked="f"/>
         </w:pict>
       </w:r>
     </w:p>
@@ -1344,7 +1344,7 @@
     <w:p>
       <w:r>
         <w:pict w14:anchorId="2D7B8F03">
-          <v:rect id="_x0000_i1137" style="width:0;height:1.5pt" o:hralign="center" o:hrstd="t" o:hr="t" fillcolor="#a0a0a0" stroked="f"/>
+          <v:rect id="_x0000_i1029" style="width:0;height:1.5pt" o:hralign="center" o:hrstd="t" o:hr="t" fillcolor="#a0a0a0" stroked="f"/>
         </w:pict>
       </w:r>
     </w:p>
@@ -3025,7 +3025,7 @@
     <w:p>
       <w:r>
         <w:pict w14:anchorId="782A2A1F">
-          <v:rect id="_x0000_i1138" style="width:0;height:1.5pt" o:hralign="center" o:hrstd="t" o:hr="t" fillcolor="#a0a0a0" stroked="f"/>
+          <v:rect id="_x0000_i1030" style="width:0;height:1.5pt" o:hralign="center" o:hrstd="t" o:hr="t" fillcolor="#a0a0a0" stroked="f"/>
         </w:pict>
       </w:r>
     </w:p>
@@ -3829,7 +3829,7 @@
       <w:r>
         <w:lastRenderedPageBreak/>
         <w:pict w14:anchorId="049EE4C5">
-          <v:rect id="_x0000_i1139" style="width:0;height:1.5pt" o:hralign="center" o:hrstd="t" o:hr="t" fillcolor="#a0a0a0" stroked="f"/>
+          <v:rect id="_x0000_i1031" style="width:0;height:1.5pt" o:hralign="center" o:hrstd="t" o:hr="t" fillcolor="#a0a0a0" stroked="f"/>
         </w:pict>
       </w:r>
     </w:p>
@@ -4598,7 +4598,7 @@
     <w:p>
       <w:r>
         <w:pict w14:anchorId="5EBB16A2">
-          <v:rect id="_x0000_i1140" style="width:0;height:1.5pt" o:hralign="center" o:hrstd="t" o:hr="t" fillcolor="#a0a0a0" stroked="f"/>
+          <v:rect id="_x0000_i1032" style="width:0;height:1.5pt" o:hralign="center" o:hrstd="t" o:hr="t" fillcolor="#a0a0a0" stroked="f"/>
         </w:pict>
       </w:r>
     </w:p>
@@ -5599,7 +5599,7 @@
     <w:p>
       <w:r>
         <w:pict w14:anchorId="4A60201D">
-          <v:rect id="_x0000_i1141" style="width:0;height:1.5pt" o:hralign="center" o:hrstd="t" o:hr="t" fillcolor="#a0a0a0" stroked="f"/>
+          <v:rect id="_x0000_i1033" style="width:0;height:1.5pt" o:hralign="center" o:hrstd="t" o:hr="t" fillcolor="#a0a0a0" stroked="f"/>
         </w:pict>
       </w:r>
     </w:p>
@@ -6524,7 +6524,7 @@
     <w:p>
       <w:r>
         <w:pict w14:anchorId="64BCDB83">
-          <v:rect id="_x0000_i1142" style="width:0;height:1.5pt" o:hralign="center" o:hrstd="t" o:hr="t" fillcolor="#a0a0a0" stroked="f"/>
+          <v:rect id="_x0000_i1034" style="width:0;height:1.5pt" o:hralign="center" o:hrstd="t" o:hr="t" fillcolor="#a0a0a0" stroked="f"/>
         </w:pict>
       </w:r>
     </w:p>
@@ -7715,7 +7715,7 @@
     <w:p>
       <w:r>
         <w:pict w14:anchorId="3C3E2EC5">
-          <v:rect id="_x0000_i1143" style="width:0;height:1.5pt" o:hralign="center" o:hrstd="t" o:hr="t" fillcolor="#a0a0a0" stroked="f"/>
+          <v:rect id="_x0000_i1035" style="width:0;height:1.5pt" o:hralign="center" o:hrstd="t" o:hr="t" fillcolor="#a0a0a0" stroked="f"/>
         </w:pict>
       </w:r>
     </w:p>
@@ -8209,7 +8209,7 @@
     <w:p>
       <w:r>
         <w:pict w14:anchorId="389510E9">
-          <v:rect id="_x0000_i1144" style="width:0;height:1.5pt" o:hralign="center" o:hrstd="t" o:hr="t" fillcolor="#a0a0a0" stroked="f"/>
+          <v:rect id="_x0000_i1036" style="width:0;height:1.5pt" o:hralign="center" o:hrstd="t" o:hr="t" fillcolor="#a0a0a0" stroked="f"/>
         </w:pict>
       </w:r>
     </w:p>
@@ -9115,7 +9115,7 @@
     <w:p>
       <w:r>
         <w:pict w14:anchorId="49B69036">
-          <v:rect id="_x0000_i1145" style="width:0;height:1.5pt" o:hralign="center" o:hrstd="t" o:hr="t" fillcolor="#a0a0a0" stroked="f"/>
+          <v:rect id="_x0000_i1037" style="width:0;height:1.5pt" o:hralign="center" o:hrstd="t" o:hr="t" fillcolor="#a0a0a0" stroked="f"/>
         </w:pict>
       </w:r>
     </w:p>
@@ -9779,7 +9779,7 @@
       <w:r>
         <w:lastRenderedPageBreak/>
         <w:pict w14:anchorId="7BC75216">
-          <v:rect id="_x0000_i1146" style="width:0;height:1.5pt" o:hralign="center" o:hrstd="t" o:hr="t" fillcolor="#a0a0a0" stroked="f"/>
+          <v:rect id="_x0000_i1038" style="width:0;height:1.5pt" o:hralign="center" o:hrstd="t" o:hr="t" fillcolor="#a0a0a0" stroked="f"/>
         </w:pict>
       </w:r>
     </w:p>
@@ -10395,7 +10395,7 @@
     <w:p>
       <w:r>
         <w:pict w14:anchorId="28A51A78">
-          <v:rect id="_x0000_i1147" style="width:0;height:1.5pt" o:hralign="center" o:hrstd="t" o:hr="t" fillcolor="#a0a0a0" stroked="f"/>
+          <v:rect id="_x0000_i1039" style="width:0;height:1.5pt" o:hralign="center" o:hrstd="t" o:hr="t" fillcolor="#a0a0a0" stroked="f"/>
         </w:pict>
       </w:r>
     </w:p>
@@ -11430,7 +11430,7 @@
     <w:p>
       <w:r>
         <w:pict w14:anchorId="60F52676">
-          <v:rect id="_x0000_i1148" style="width:0;height:1.5pt" o:hralign="center" o:hrstd="t" o:hr="t" fillcolor="#a0a0a0" stroked="f"/>
+          <v:rect id="_x0000_i1040" style="width:0;height:1.5pt" o:hralign="center" o:hrstd="t" o:hr="t" fillcolor="#a0a0a0" stroked="f"/>
         </w:pict>
       </w:r>
     </w:p>
@@ -12175,7 +12175,7 @@
       <w:r>
         <w:lastRenderedPageBreak/>
         <w:pict w14:anchorId="37D177E6">
-          <v:rect id="_x0000_i1149" style="width:0;height:1.5pt" o:hralign="center" o:hrstd="t" o:hr="t" fillcolor="#a0a0a0" stroked="f"/>
+          <v:rect id="_x0000_i1041" style="width:0;height:1.5pt" o:hralign="center" o:hrstd="t" o:hr="t" fillcolor="#a0a0a0" stroked="f"/>
         </w:pict>
       </w:r>
     </w:p>
@@ -12600,7 +12600,7 @@
     <w:p>
       <w:r>
         <w:pict w14:anchorId="79F19622">
-          <v:rect id="_x0000_i1150" style="width:0;height:1.5pt" o:hralign="center" o:hrstd="t" o:hr="t" fillcolor="#a0a0a0" stroked="f"/>
+          <v:rect id="_x0000_i1042" style="width:0;height:1.5pt" o:hralign="center" o:hrstd="t" o:hr="t" fillcolor="#a0a0a0" stroked="f"/>
         </w:pict>
       </w:r>
     </w:p>
@@ -12652,6 +12652,1484 @@
     <w:p>
       <w:r>
         <w:t>Phase 3.5's terminal will land into a system that remembers what it ran, learns what to refuse, and explains itself to its operator. That is the architecture this blueprint exists to produce.</w:t>
+      </w:r>
+    </w:p>
+    <w:p>
+      <w:pPr>
+        <w:rPr>
+          <w:b/>
+          <w:bCs/>
+        </w:rPr>
+      </w:pPr>
+      <w:r>
+        <w:rPr>
+          <w:b/>
+          <w:bCs/>
+        </w:rPr>
+        <w:t>JARVIS Phase 3D — Personal Intelligence Layer (Design)</w:t>
+      </w:r>
+    </w:p>
+    <w:p>
+      <w:pPr>
+        <w:rPr>
+          <w:b/>
+          <w:bCs/>
+        </w:rPr>
+      </w:pPr>
+      <w:r>
+        <w:rPr>
+          <w:b/>
+          <w:bCs/>
+        </w:rPr>
+        <w:t>1. Proposed 3D Subsections</w:t>
+      </w:r>
+    </w:p>
+    <w:p>
+      <w:pPr>
+        <w:numPr>
+          <w:ilvl w:val="0"/>
+          <w:numId w:val="68"/>
+        </w:numPr>
+      </w:pPr>
+      <w:r>
+        <w:rPr>
+          <w:b/>
+          <w:bCs/>
+        </w:rPr>
+        <w:t>3D-1 Preference Ledger</w:t>
+      </w:r>
+      <w:r>
+        <w:t xml:space="preserve"> — append-only store of explicit user preferences (tone, topics-to-avoid, working hours, project priorities). Hand-curated, not inferred.</w:t>
+      </w:r>
+    </w:p>
+    <w:p>
+      <w:pPr>
+        <w:numPr>
+          <w:ilvl w:val="0"/>
+          <w:numId w:val="68"/>
+        </w:numPr>
+      </w:pPr>
+      <w:r>
+        <w:rPr>
+          <w:b/>
+          <w:bCs/>
+        </w:rPr>
+        <w:t>3D-2 Goal Continuity Store</w:t>
+      </w:r>
+      <w:r>
+        <w:t xml:space="preserve"> — typed goals table (id, title, status, created_at, last_touched, parent_id). User-declared only. No auto-detection.</w:t>
+      </w:r>
+    </w:p>
+    <w:p>
+      <w:pPr>
+        <w:numPr>
+          <w:ilvl w:val="0"/>
+          <w:numId w:val="68"/>
+        </w:numPr>
+      </w:pPr>
+      <w:r>
+        <w:rPr>
+          <w:b/>
+          <w:bCs/>
+        </w:rPr>
+        <w:t>3D-3 Timeline Index</w:t>
+      </w:r>
+      <w:r>
+        <w:t xml:space="preserve"> — read-only chronological view over existing session summaries + project_state snapshots. Pure projection, no new writes.</w:t>
+      </w:r>
+    </w:p>
+    <w:p>
+      <w:pPr>
+        <w:numPr>
+          <w:ilvl w:val="0"/>
+          <w:numId w:val="68"/>
+        </w:numPr>
+      </w:pPr>
+      <w:r>
+        <w:rPr>
+          <w:b/>
+          <w:bCs/>
+        </w:rPr>
+        <w:t>3D-4 Memory Weighting (passive)</w:t>
+      </w:r>
+      <w:r>
+        <w:t xml:space="preserve"> — score function over existing memory candidates using {recency, explicit pin, retrieval-hit count}. Stored as a </w:t>
+      </w:r>
+      <w:r>
+        <w:rPr>
+          <w:i/>
+          <w:iCs/>
+        </w:rPr>
+        <w:t>view</w:t>
+      </w:r>
+      <w:r>
+        <w:t>, not a mutation of candidates.</w:t>
+      </w:r>
+    </w:p>
+    <w:p>
+      <w:pPr>
+        <w:numPr>
+          <w:ilvl w:val="0"/>
+          <w:numId w:val="68"/>
+        </w:numPr>
+      </w:pPr>
+      <w:r>
+        <w:rPr>
+          <w:b/>
+          <w:bCs/>
+        </w:rPr>
+        <w:t>3D-5 Conversation Curator</w:t>
+      </w:r>
+      <w:r>
+        <w:t xml:space="preserve"> — UI-only surface: lets user mark, merge, split, demote, or delete session summaries and memory candidates. Writes via existing audit log.</w:t>
+      </w:r>
+    </w:p>
+    <w:p>
+      <w:pPr>
+        <w:numPr>
+          <w:ilvl w:val="0"/>
+          <w:numId w:val="68"/>
+        </w:numPr>
+      </w:pPr>
+      <w:r>
+        <w:rPr>
+          <w:b/>
+          <w:bCs/>
+        </w:rPr>
+        <w:t>3D-6 Reflection Prompts (manual)</w:t>
+      </w:r>
+      <w:r>
+        <w:t xml:space="preserve"> — user-invoked endpoint that returns a templated reflection question seeded by recent timeline slice. No autonomous firing.</w:t>
+      </w:r>
+    </w:p>
+    <w:p>
+      <w:pPr>
+        <w:numPr>
+          <w:ilvl w:val="0"/>
+          <w:numId w:val="68"/>
+        </w:numPr>
+      </w:pPr>
+      <w:r>
+        <w:rPr>
+          <w:b/>
+          <w:bCs/>
+        </w:rPr>
+        <w:lastRenderedPageBreak/>
+        <w:t>3D-7 Keeper Interface (skeleton only)</w:t>
+      </w:r>
+      <w:r>
+        <w:t xml:space="preserve"> — abstract Keeper contract + registry. Zero concrete implementations. Just the seam.</w:t>
+      </w:r>
+    </w:p>
+    <w:p>
+      <w:pPr>
+        <w:numPr>
+          <w:ilvl w:val="0"/>
+          <w:numId w:val="68"/>
+        </w:numPr>
+      </w:pPr>
+      <w:r>
+        <w:rPr>
+          <w:b/>
+          <w:bCs/>
+        </w:rPr>
+        <w:t>3D-8 Human Review Queue</w:t>
+      </w:r>
+      <w:r>
+        <w:t xml:space="preserve"> — single inbox for: pending memory candidates, weighting changes, goal status transitions awaiting user confirmation.</w:t>
+      </w:r>
+    </w:p>
+    <w:p>
+      <w:pPr>
+        <w:numPr>
+          <w:ilvl w:val="0"/>
+          <w:numId w:val="68"/>
+        </w:numPr>
+      </w:pPr>
+      <w:r>
+        <w:rPr>
+          <w:b/>
+          <w:bCs/>
+        </w:rPr>
+        <w:t>3D-9 Consent &amp; Capability Manifest</w:t>
+      </w:r>
+      <w:r>
+        <w:t xml:space="preserve"> — per-feature on/off + scope file (~/jarvis/consent.json), surfaced in UI, required check before any 3D feature acts.</w:t>
+      </w:r>
+    </w:p>
+    <w:p>
+      <w:pPr>
+        <w:rPr>
+          <w:b/>
+          <w:bCs/>
+        </w:rPr>
+      </w:pPr>
+      <w:r>
+        <w:rPr>
+          <w:b/>
+          <w:bCs/>
+        </w:rPr>
+        <w:t>2. Dependency Ordering</w:t>
+      </w:r>
+    </w:p>
+    <w:p>
+      <w:r>
+        <w:t>3D-9 (Consent)  ──</w:t>
+      </w:r>
+      <w:r>
+        <w:rPr>
+          <w:rFonts w:ascii="Arial" w:hAnsi="Arial" w:cs="Arial"/>
+        </w:rPr>
+        <w:t>►</w:t>
+      </w:r>
+      <w:r>
+        <w:t xml:space="preserve"> 3D-1 (Preferences)</w:t>
+      </w:r>
+    </w:p>
+    <w:p>
+      <w:r>
+        <w:t xml:space="preserve">                 └</w:t>
+      </w:r>
+      <w:r>
+        <w:rPr>
+          <w:rFonts w:ascii="Arial" w:hAnsi="Arial" w:cs="Arial"/>
+        </w:rPr>
+        <w:t>►</w:t>
+      </w:r>
+      <w:r>
+        <w:t xml:space="preserve"> 3D-2 (Goals)</w:t>
+      </w:r>
+    </w:p>
+    <w:p>
+      <w:r>
+        <w:t xml:space="preserve">                 └</w:t>
+      </w:r>
+      <w:r>
+        <w:rPr>
+          <w:rFonts w:ascii="Arial" w:hAnsi="Arial" w:cs="Arial"/>
+        </w:rPr>
+        <w:t>►</w:t>
+      </w:r>
+      <w:r>
+        <w:t xml:space="preserve"> 3D-7 (Keeper interface)</w:t>
+      </w:r>
+    </w:p>
+    <w:p/>
+    <w:p>
+      <w:r>
+        <w:t>3D-3 (Timeline) ──</w:t>
+      </w:r>
+      <w:r>
+        <w:rPr>
+          <w:rFonts w:ascii="Arial" w:hAnsi="Arial" w:cs="Arial"/>
+        </w:rPr>
+        <w:t>►</w:t>
+      </w:r>
+      <w:r>
+        <w:t xml:space="preserve"> 3D-4 (Weighting view) </w:t>
+      </w:r>
+      <w:r>
+        <w:rPr>
+          <w:rFonts w:ascii="Aptos" w:hAnsi="Aptos" w:cs="Aptos"/>
+        </w:rPr>
+        <w:t>──</w:t>
+      </w:r>
+      <w:r>
+        <w:rPr>
+          <w:rFonts w:ascii="Arial" w:hAnsi="Arial" w:cs="Arial"/>
+        </w:rPr>
+        <w:t>►</w:t>
+      </w:r>
+      <w:r>
+        <w:t xml:space="preserve"> 3D-5 (Curator)</w:t>
+      </w:r>
+    </w:p>
+    <w:p>
+      <w:r>
+        <w:t xml:space="preserve">                                            └</w:t>
+      </w:r>
+      <w:r>
+        <w:rPr>
+          <w:rFonts w:ascii="Arial" w:hAnsi="Arial" w:cs="Arial"/>
+        </w:rPr>
+        <w:t>►</w:t>
+      </w:r>
+      <w:r>
+        <w:t xml:space="preserve"> 3D-8 (Review Queue)</w:t>
+      </w:r>
+    </w:p>
+    <w:p/>
+    <w:p>
+      <w:r>
+        <w:t>3D-6 (Reflection) depends on 3D-3 + 3D-1</w:t>
+      </w:r>
+    </w:p>
+    <w:p>
+      <w:r>
+        <w:t>Consent manifest is the gate; nothing else ships before it.</w:t>
+      </w:r>
+    </w:p>
+    <w:p>
+      <w:pPr>
+        <w:rPr>
+          <w:b/>
+          <w:bCs/>
+        </w:rPr>
+      </w:pPr>
+      <w:r>
+        <w:rPr>
+          <w:b/>
+          <w:bCs/>
+        </w:rPr>
+        <w:t>3. Safety Boundaries (hard invariants)</w:t>
+      </w:r>
+    </w:p>
+    <w:p>
+      <w:pPr>
+        <w:numPr>
+          <w:ilvl w:val="0"/>
+          <w:numId w:val="69"/>
+        </w:numPr>
+      </w:pPr>
+      <w:r>
+        <w:t>No 3D component injects into live prompts. Working memory remains opt-in per-request.</w:t>
+      </w:r>
+    </w:p>
+    <w:p>
+      <w:pPr>
+        <w:numPr>
+          <w:ilvl w:val="0"/>
+          <w:numId w:val="69"/>
+        </w:numPr>
+      </w:pPr>
+      <w:r>
+        <w:t>All writes go through existing audit log; no silent mutations.</w:t>
+      </w:r>
+    </w:p>
+    <w:p>
+      <w:pPr>
+        <w:numPr>
+          <w:ilvl w:val="0"/>
+          <w:numId w:val="69"/>
+        </w:numPr>
+      </w:pPr>
+      <w:r>
+        <w:t xml:space="preserve">Keeper interface exists but cannot be </w:t>
+      </w:r>
+      <w:r>
+        <w:rPr>
+          <w:i/>
+          <w:iCs/>
+        </w:rPr>
+        <w:t>invoked</w:t>
+      </w:r>
+      <w:r>
+        <w:t xml:space="preserve"> by anything autonomous in 3D.</w:t>
+      </w:r>
+    </w:p>
+    <w:p>
+      <w:pPr>
+        <w:numPr>
+          <w:ilvl w:val="0"/>
+          <w:numId w:val="69"/>
+        </w:numPr>
+      </w:pPr>
+      <w:r>
+        <w:t xml:space="preserve">Memory weighting is a </w:t>
+      </w:r>
+      <w:r>
+        <w:rPr>
+          <w:b/>
+          <w:bCs/>
+        </w:rPr>
+        <w:t>derived view</w:t>
+      </w:r>
+      <w:r>
+        <w:t>, never overwrites stored fields.</w:t>
+      </w:r>
+    </w:p>
+    <w:p>
+      <w:pPr>
+        <w:numPr>
+          <w:ilvl w:val="0"/>
+          <w:numId w:val="69"/>
+        </w:numPr>
+      </w:pPr>
+      <w:r>
+        <w:t>No model call may read goals/preferences unless the caller passes an explicit personal_context: true flag, which is logged.</w:t>
+      </w:r>
+    </w:p>
+    <w:p>
+      <w:pPr>
+        <w:numPr>
+          <w:ilvl w:val="0"/>
+          <w:numId w:val="69"/>
+        </w:numPr>
+      </w:pPr>
+      <w:r>
+        <w:t>Reflection is pull-only; no scheduler, no notifications.</w:t>
+      </w:r>
+    </w:p>
+    <w:p>
+      <w:pPr>
+        <w:numPr>
+          <w:ilvl w:val="0"/>
+          <w:numId w:val="69"/>
+        </w:numPr>
+      </w:pPr>
+      <w:r>
+        <w:t>All deletions are soft (tombstone) for ≥30 days.</w:t>
+      </w:r>
+    </w:p>
+    <w:p>
+      <w:pPr>
+        <w:rPr>
+          <w:b/>
+          <w:bCs/>
+        </w:rPr>
+      </w:pPr>
+      <w:r>
+        <w:rPr>
+          <w:b/>
+          <w:bCs/>
+        </w:rPr>
+        <w:t>4. Psychological-Risk Analysis</w:t>
+      </w:r>
+    </w:p>
+    <w:tbl>
+      <w:tblPr>
+        <w:tblW w:w="0" w:type="auto"/>
+        <w:tblCellSpacing w:w="15" w:type="dxa"/>
+        <w:tblCellMar>
+          <w:top w:w="15" w:type="dxa"/>
+          <w:left w:w="15" w:type="dxa"/>
+          <w:bottom w:w="15" w:type="dxa"/>
+          <w:right w:w="15" w:type="dxa"/>
+        </w:tblCellMar>
+        <w:tblLook w:val="04A0" w:firstRow="1" w:lastRow="0" w:firstColumn="1" w:lastColumn="0" w:noHBand="0" w:noVBand="1"/>
+      </w:tblPr>
+      <w:tblGrid>
+        <w:gridCol w:w="2430"/>
+        <w:gridCol w:w="2627"/>
+        <w:gridCol w:w="3969"/>
+      </w:tblGrid>
+      <w:tr>
+        <w:trPr>
+          <w:tblHeader/>
+          <w:tblCellSpacing w:w="15" w:type="dxa"/>
+        </w:trPr>
+        <w:tc>
+          <w:tcPr>
+            <w:tcW w:w="0" w:type="auto"/>
+            <w:vAlign w:val="center"/>
+            <w:hideMark/>
+          </w:tcPr>
+          <w:p>
+            <w:pPr>
+              <w:rPr>
+                <w:b/>
+                <w:bCs/>
+              </w:rPr>
+            </w:pPr>
+            <w:r>
+              <w:rPr>
+                <w:b/>
+                <w:bCs/>
+              </w:rPr>
+              <w:lastRenderedPageBreak/>
+              <w:t>Risk</w:t>
+            </w:r>
+          </w:p>
+        </w:tc>
+        <w:tc>
+          <w:tcPr>
+            <w:tcW w:w="0" w:type="auto"/>
+            <w:vAlign w:val="center"/>
+            <w:hideMark/>
+          </w:tcPr>
+          <w:p>
+            <w:pPr>
+              <w:rPr>
+                <w:b/>
+                <w:bCs/>
+              </w:rPr>
+            </w:pPr>
+            <w:r>
+              <w:rPr>
+                <w:b/>
+                <w:bCs/>
+              </w:rPr>
+              <w:t>Vector</w:t>
+            </w:r>
+          </w:p>
+        </w:tc>
+        <w:tc>
+          <w:tcPr>
+            <w:tcW w:w="0" w:type="auto"/>
+            <w:vAlign w:val="center"/>
+            <w:hideMark/>
+          </w:tcPr>
+          <w:p>
+            <w:pPr>
+              <w:rPr>
+                <w:b/>
+                <w:bCs/>
+              </w:rPr>
+            </w:pPr>
+            <w:r>
+              <w:rPr>
+                <w:b/>
+                <w:bCs/>
+              </w:rPr>
+              <w:t>Mitigation in 3D</w:t>
+            </w:r>
+          </w:p>
+        </w:tc>
+      </w:tr>
+      <w:tr>
+        <w:trPr>
+          <w:tblCellSpacing w:w="15" w:type="dxa"/>
+        </w:trPr>
+        <w:tc>
+          <w:tcPr>
+            <w:tcW w:w="0" w:type="auto"/>
+            <w:vAlign w:val="center"/>
+            <w:hideMark/>
+          </w:tcPr>
+          <w:p>
+            <w:r>
+              <w:t>Parasocial drift</w:t>
+            </w:r>
+          </w:p>
+        </w:tc>
+        <w:tc>
+          <w:tcPr>
+            <w:tcW w:w="0" w:type="auto"/>
+            <w:vAlign w:val="center"/>
+            <w:hideMark/>
+          </w:tcPr>
+          <w:p>
+            <w:r>
+              <w:t>Reflection prompts feeling like a "friend"</w:t>
+            </w:r>
+          </w:p>
+        </w:tc>
+        <w:tc>
+          <w:tcPr>
+            <w:tcW w:w="0" w:type="auto"/>
+            <w:vAlign w:val="center"/>
+            <w:hideMark/>
+          </w:tcPr>
+          <w:p>
+            <w:r>
+              <w:t>Template language stays utilitarian; no first-person AI voice in prompts</w:t>
+            </w:r>
+          </w:p>
+        </w:tc>
+      </w:tr>
+      <w:tr>
+        <w:trPr>
+          <w:tblCellSpacing w:w="15" w:type="dxa"/>
+        </w:trPr>
+        <w:tc>
+          <w:tcPr>
+            <w:tcW w:w="0" w:type="auto"/>
+            <w:vAlign w:val="center"/>
+            <w:hideMark/>
+          </w:tcPr>
+          <w:p>
+            <w:r>
+              <w:t>Identity calcification</w:t>
+            </w:r>
+          </w:p>
+        </w:tc>
+        <w:tc>
+          <w:tcPr>
+            <w:tcW w:w="0" w:type="auto"/>
+            <w:vAlign w:val="center"/>
+            <w:hideMark/>
+          </w:tcPr>
+          <w:p>
+            <w:r>
+              <w:t>System reflects user's past self back, ossifying it</w:t>
+            </w:r>
+          </w:p>
+        </w:tc>
+        <w:tc>
+          <w:tcPr>
+            <w:tcW w:w="0" w:type="auto"/>
+            <w:vAlign w:val="center"/>
+            <w:hideMark/>
+          </w:tcPr>
+          <w:p>
+            <w:r>
+              <w:t>Timeline shows decay; weighting decays old items; user can demote</w:t>
+            </w:r>
+          </w:p>
+        </w:tc>
+      </w:tr>
+      <w:tr>
+        <w:trPr>
+          <w:tblCellSpacing w:w="15" w:type="dxa"/>
+        </w:trPr>
+        <w:tc>
+          <w:tcPr>
+            <w:tcW w:w="0" w:type="auto"/>
+            <w:vAlign w:val="center"/>
+            <w:hideMark/>
+          </w:tcPr>
+          <w:p>
+            <w:r>
+              <w:t>Surveillance unease</w:t>
+            </w:r>
+          </w:p>
+        </w:tc>
+        <w:tc>
+          <w:tcPr>
+            <w:tcW w:w="0" w:type="auto"/>
+            <w:vAlign w:val="center"/>
+            <w:hideMark/>
+          </w:tcPr>
+          <w:p>
+            <w:r>
+              <w:t>Feeling watched by passive weighting</w:t>
+            </w:r>
+          </w:p>
+        </w:tc>
+        <w:tc>
+          <w:tcPr>
+            <w:tcW w:w="0" w:type="auto"/>
+            <w:vAlign w:val="center"/>
+            <w:hideMark/>
+          </w:tcPr>
+          <w:p>
+            <w:r>
+              <w:t>Curator UI shows exactly what is weighted and why; one-click purge</w:t>
+            </w:r>
+          </w:p>
+        </w:tc>
+      </w:tr>
+      <w:tr>
+        <w:trPr>
+          <w:tblCellSpacing w:w="15" w:type="dxa"/>
+        </w:trPr>
+        <w:tc>
+          <w:tcPr>
+            <w:tcW w:w="0" w:type="auto"/>
+            <w:vAlign w:val="center"/>
+            <w:hideMark/>
+          </w:tcPr>
+          <w:p>
+            <w:r>
+              <w:t>Over-reliance / outsourced cognition</w:t>
+            </w:r>
+          </w:p>
+        </w:tc>
+        <w:tc>
+          <w:tcPr>
+            <w:tcW w:w="0" w:type="auto"/>
+            <w:vAlign w:val="center"/>
+            <w:hideMark/>
+          </w:tcPr>
+          <w:p>
+            <w:r>
+              <w:t>Reflection becoming a substitute for thinking</w:t>
+            </w:r>
+          </w:p>
+        </w:tc>
+        <w:tc>
+          <w:tcPr>
+            <w:tcW w:w="0" w:type="auto"/>
+            <w:vAlign w:val="center"/>
+            <w:hideMark/>
+          </w:tcPr>
+          <w:p>
+            <w:r>
+              <w:t>Manual-only invocation; no streaks, no nudges, no gamification</w:t>
+            </w:r>
+          </w:p>
+        </w:tc>
+      </w:tr>
+      <w:tr>
+        <w:trPr>
+          <w:tblCellSpacing w:w="15" w:type="dxa"/>
+        </w:trPr>
+        <w:tc>
+          <w:tcPr>
+            <w:tcW w:w="0" w:type="auto"/>
+            <w:vAlign w:val="center"/>
+            <w:hideMark/>
+          </w:tcPr>
+          <w:p>
+            <w:r>
+              <w:t>Negative self-pattern reinforcement</w:t>
+            </w:r>
+          </w:p>
+        </w:tc>
+        <w:tc>
+          <w:tcPr>
+            <w:tcW w:w="0" w:type="auto"/>
+            <w:vAlign w:val="center"/>
+            <w:hideMark/>
+          </w:tcPr>
+          <w:p>
+            <w:r>
+              <w:t>Surfacing recurring bad-mood content</w:t>
+            </w:r>
+          </w:p>
+        </w:tc>
+        <w:tc>
+          <w:tcPr>
+            <w:tcW w:w="0" w:type="auto"/>
+            <w:vAlign w:val="center"/>
+            <w:hideMark/>
+          </w:tcPr>
+          <w:p>
+            <w:r>
+              <w:t>Curator allows topic blacklists; weighting respects them</w:t>
+            </w:r>
+          </w:p>
+        </w:tc>
+      </w:tr>
+      <w:tr>
+        <w:trPr>
+          <w:tblCellSpacing w:w="15" w:type="dxa"/>
+        </w:trPr>
+        <w:tc>
+          <w:tcPr>
+            <w:tcW w:w="0" w:type="auto"/>
+            <w:vAlign w:val="center"/>
+            <w:hideMark/>
+          </w:tcPr>
+          <w:p>
+            <w:r>
+              <w:t>False intimacy from "memory"</w:t>
+            </w:r>
+          </w:p>
+        </w:tc>
+        <w:tc>
+          <w:tcPr>
+            <w:tcW w:w="0" w:type="auto"/>
+            <w:vAlign w:val="center"/>
+            <w:hideMark/>
+          </w:tcPr>
+          <w:p>
+            <w:r>
+              <w:t>User attributing care to recall</w:t>
+            </w:r>
+          </w:p>
+        </w:tc>
+        <w:tc>
+          <w:tcPr>
+            <w:tcW w:w="0" w:type="auto"/>
+            <w:vAlign w:val="center"/>
+            <w:hideMark/>
+          </w:tcPr>
+          <w:p>
+            <w:r>
+              <w:t>No anthropomorphic phrasing in any 3D-generated text</w:t>
+            </w:r>
+          </w:p>
+        </w:tc>
+      </w:tr>
+    </w:tbl>
+    <w:p>
+      <w:pPr>
+        <w:rPr>
+          <w:b/>
+          <w:bCs/>
+        </w:rPr>
+      </w:pPr>
+      <w:r>
+        <w:rPr>
+          <w:b/>
+          <w:bCs/>
+        </w:rPr>
+        <w:t>5. Abuse / Failure Modes</w:t>
+      </w:r>
+    </w:p>
+    <w:p>
+      <w:pPr>
+        <w:numPr>
+          <w:ilvl w:val="0"/>
+          <w:numId w:val="70"/>
+        </w:numPr>
+      </w:pPr>
+      <w:r>
+        <w:rPr>
+          <w:b/>
+          <w:bCs/>
+        </w:rPr>
+        <w:t>Goal-state poisoning</w:t>
+      </w:r>
+      <w:r>
+        <w:t xml:space="preserve"> — bad summary marks a goal "complete" incorrectly → require explicit user confirm for any status transition (3D-8).</w:t>
+      </w:r>
+    </w:p>
+    <w:p>
+      <w:pPr>
+        <w:numPr>
+          <w:ilvl w:val="0"/>
+          <w:numId w:val="70"/>
+        </w:numPr>
+      </w:pPr>
+      <w:r>
+        <w:rPr>
+          <w:b/>
+          <w:bCs/>
+        </w:rPr>
+        <w:t>Weighting feedback loop</w:t>
+      </w:r>
+      <w:r>
+        <w:t xml:space="preserve"> — retrieved items get higher weight, get retrieved more → cap weight contribution from retrieval hits; decay weekly.</w:t>
+      </w:r>
+    </w:p>
+    <w:p>
+      <w:pPr>
+        <w:numPr>
+          <w:ilvl w:val="0"/>
+          <w:numId w:val="70"/>
+        </w:numPr>
+      </w:pPr>
+      <w:r>
+        <w:rPr>
+          <w:b/>
+          <w:bCs/>
+        </w:rPr>
+        <w:t>Preference contradiction</w:t>
+      </w:r>
+      <w:r>
+        <w:t xml:space="preserve"> — preferences drift / conflict → ledger is append-only with effective-date; resolver picks latest </w:t>
+      </w:r>
+      <w:r>
+        <w:rPr>
+          <w:i/>
+          <w:iCs/>
+        </w:rPr>
+        <w:t>plus</w:t>
+      </w:r>
+      <w:r>
+        <w:t xml:space="preserve"> shows the conflict.</w:t>
+      </w:r>
+    </w:p>
+    <w:p>
+      <w:pPr>
+        <w:numPr>
+          <w:ilvl w:val="0"/>
+          <w:numId w:val="70"/>
+        </w:numPr>
+      </w:pPr>
+      <w:r>
+        <w:rPr>
+          <w:b/>
+          <w:bCs/>
+        </w:rPr>
+        <w:t>Timeline as evidence</w:t>
+      </w:r>
+      <w:r>
+        <w:t xml:space="preserve"> — user or third party treats it as authoritative log → label as "summaries, not transcripts"; link to source sessions.</w:t>
+      </w:r>
+    </w:p>
+    <w:p>
+      <w:pPr>
+        <w:numPr>
+          <w:ilvl w:val="0"/>
+          <w:numId w:val="70"/>
+        </w:numPr>
+      </w:pPr>
+      <w:r>
+        <w:rPr>
+          <w:b/>
+          <w:bCs/>
+        </w:rPr>
+        <w:t>Keeper interface misuse</w:t>
+      </w:r>
+      <w:r>
+        <w:t xml:space="preserve"> — future code wires an autonomous Keeper without consent → registry refuses to load any Keeper unless consent manifest lists it by name.</w:t>
+      </w:r>
+    </w:p>
+    <w:p>
+      <w:pPr>
+        <w:numPr>
+          <w:ilvl w:val="0"/>
+          <w:numId w:val="70"/>
+        </w:numPr>
+      </w:pPr>
+      <w:r>
+        <w:rPr>
+          <w:b/>
+          <w:bCs/>
+        </w:rPr>
+        <w:t>Reflection prompt manipulation</w:t>
+      </w:r>
+      <w:r>
+        <w:t xml:space="preserve"> — template injection from summary content → reflection seeds are escaped/quoted, never composed into instructions.</w:t>
+      </w:r>
+    </w:p>
+    <w:p>
+      <w:pPr>
+        <w:rPr>
+          <w:b/>
+          <w:bCs/>
+        </w:rPr>
+      </w:pPr>
+      <w:r>
+        <w:rPr>
+          <w:b/>
+          <w:bCs/>
+        </w:rPr>
+        <w:t>6. Governance / Consent Model</w:t>
+      </w:r>
+    </w:p>
+    <w:p>
+      <w:pPr>
+        <w:numPr>
+          <w:ilvl w:val="0"/>
+          <w:numId w:val="71"/>
+        </w:numPr>
+      </w:pPr>
+      <w:r>
+        <w:t>consent.json schema: { feature_id, enabled, scope, granted_at, granted_by:"user", revocable:true }.</w:t>
+      </w:r>
+    </w:p>
+    <w:p>
+      <w:pPr>
+        <w:numPr>
+          <w:ilvl w:val="0"/>
+          <w:numId w:val="71"/>
+        </w:numPr>
+      </w:pPr>
+      <w:r>
+        <w:t>Default state: every 3D feature enabled: false.</w:t>
+      </w:r>
+    </w:p>
+    <w:p>
+      <w:pPr>
+        <w:numPr>
+          <w:ilvl w:val="0"/>
+          <w:numId w:val="71"/>
+        </w:numPr>
+      </w:pPr>
+      <w:r>
+        <w:lastRenderedPageBreak/>
+        <w:t>Toggling requires UI action — no programmatic enable.</w:t>
+      </w:r>
+    </w:p>
+    <w:p>
+      <w:pPr>
+        <w:numPr>
+          <w:ilvl w:val="0"/>
+          <w:numId w:val="71"/>
+        </w:numPr>
+      </w:pPr>
+      <w:r>
+        <w:t>Revocation triggers: (a) immediate read-block, (b) async tombstone of derived data, (c) audit entry.</w:t>
+      </w:r>
+    </w:p>
+    <w:p>
+      <w:pPr>
+        <w:numPr>
+          <w:ilvl w:val="0"/>
+          <w:numId w:val="71"/>
+        </w:numPr>
+      </w:pPr>
+      <w:r>
+        <w:t>Every model call touching personal data emits a row: {ts, feature_id, data_classes_read, caller}.</w:t>
+      </w:r>
+    </w:p>
+    <w:p>
+      <w:pPr>
+        <w:numPr>
+          <w:ilvl w:val="0"/>
+          <w:numId w:val="71"/>
+        </w:numPr>
+      </w:pPr>
+      <w:r>
+        <w:t>Quarterly self-audit script (3E, not now) reads these rows; 3D just emits them.</w:t>
+      </w:r>
+    </w:p>
+    <w:p>
+      <w:pPr>
+        <w:rPr>
+          <w:b/>
+          <w:bCs/>
+        </w:rPr>
+      </w:pPr>
+      <w:r>
+        <w:rPr>
+          <w:b/>
+          <w:bCs/>
+        </w:rPr>
+        <w:t>7. Disabled by Default</w:t>
+      </w:r>
+    </w:p>
+    <w:p>
+      <w:pPr>
+        <w:numPr>
+          <w:ilvl w:val="0"/>
+          <w:numId w:val="72"/>
+        </w:numPr>
+      </w:pPr>
+      <w:r>
+        <w:t>All Keepers (only interface exists).</w:t>
+      </w:r>
+    </w:p>
+    <w:p>
+      <w:pPr>
+        <w:numPr>
+          <w:ilvl w:val="0"/>
+          <w:numId w:val="72"/>
+        </w:numPr>
+      </w:pPr>
+      <w:r>
+        <w:t>Reflection prompts.</w:t>
+      </w:r>
+    </w:p>
+    <w:p>
+      <w:pPr>
+        <w:numPr>
+          <w:ilvl w:val="0"/>
+          <w:numId w:val="72"/>
+        </w:numPr>
+      </w:pPr>
+      <w:r>
+        <w:t>Memory weighting contribution to retrieval ranking (computed but not applied).</w:t>
+      </w:r>
+    </w:p>
+    <w:p>
+      <w:pPr>
+        <w:numPr>
+          <w:ilvl w:val="0"/>
+          <w:numId w:val="72"/>
+        </w:numPr>
+      </w:pPr>
+      <w:r>
+        <w:t>Goal continuity injection into any prompt.</w:t>
+      </w:r>
+    </w:p>
+    <w:p>
+      <w:pPr>
+        <w:numPr>
+          <w:ilvl w:val="0"/>
+          <w:numId w:val="72"/>
+        </w:numPr>
+      </w:pPr>
+      <w:r>
+        <w:t>Timeline export.</w:t>
+      </w:r>
+    </w:p>
+    <w:p>
+      <w:pPr>
+        <w:numPr>
+          <w:ilvl w:val="0"/>
+          <w:numId w:val="72"/>
+        </w:numPr>
+      </w:pPr>
+      <w:r>
+        <w:t>Preference auto-application to system prompts.</w:t>
+      </w:r>
+    </w:p>
+    <w:p>
+      <w:r>
+        <w:t>User must opt in per feature.</w:t>
+      </w:r>
+    </w:p>
+    <w:p>
+      <w:pPr>
+        <w:rPr>
+          <w:b/>
+          <w:bCs/>
+        </w:rPr>
+      </w:pPr>
+      <w:r>
+        <w:rPr>
+          <w:b/>
+          <w:bCs/>
+        </w:rPr>
+        <w:t>8. Do NOT Implement in 3D</w:t>
+      </w:r>
+    </w:p>
+    <w:p>
+      <w:pPr>
+        <w:numPr>
+          <w:ilvl w:val="0"/>
+          <w:numId w:val="73"/>
+        </w:numPr>
+      </w:pPr>
+      <w:r>
+        <w:rPr>
+          <w:b/>
+          <w:bCs/>
+        </w:rPr>
+        <w:t>Silence Keeper</w:t>
+      </w:r>
+      <w:r>
+        <w:t xml:space="preserve"> — requires autonomous loop + emotional inference. Defer to post-Keeper-governance phase.</w:t>
+      </w:r>
+    </w:p>
+    <w:p>
+      <w:pPr>
+        <w:numPr>
+          <w:ilvl w:val="0"/>
+          <w:numId w:val="73"/>
+        </w:numPr>
+      </w:pPr>
+      <w:r>
+        <w:rPr>
+          <w:b/>
+          <w:bCs/>
+        </w:rPr>
+        <w:t>Meaning Coach</w:t>
+      </w:r>
+      <w:r>
+        <w:t xml:space="preserve"> — implies normative judgments about user's life. Out of scope; possibly never.</w:t>
+      </w:r>
+    </w:p>
+    <w:p>
+      <w:pPr>
+        <w:numPr>
+          <w:ilvl w:val="0"/>
+          <w:numId w:val="73"/>
+        </w:numPr>
+      </w:pPr>
+      <w:r>
+        <w:rPr>
+          <w:b/>
+          <w:bCs/>
+        </w:rPr>
+        <w:t>Any autonomous Keeper execution</w:t>
+      </w:r>
+      <w:r>
+        <w:t xml:space="preserve"> — no schedulers, no triggers, no background daemons.</w:t>
+      </w:r>
+    </w:p>
+    <w:p>
+      <w:pPr>
+        <w:numPr>
+          <w:ilvl w:val="0"/>
+          <w:numId w:val="73"/>
+        </w:numPr>
+      </w:pPr>
+      <w:r>
+        <w:rPr>
+          <w:b/>
+          <w:bCs/>
+        </w:rPr>
+        <w:t>Inferred preferences / implicit profiling</w:t>
+      </w:r>
+      <w:r>
+        <w:t xml:space="preserve"> — preferences are user-declared only in 3D.</w:t>
+      </w:r>
+    </w:p>
+    <w:p>
+      <w:pPr>
+        <w:numPr>
+          <w:ilvl w:val="0"/>
+          <w:numId w:val="73"/>
+        </w:numPr>
+      </w:pPr>
+      <w:r>
+        <w:rPr>
+          <w:b/>
+          <w:bCs/>
+        </w:rPr>
+        <w:t>Emotion/sentiment classification</w:t>
+      </w:r>
+      <w:r>
+        <w:t xml:space="preserve"> of user text.</w:t>
+      </w:r>
+    </w:p>
+    <w:p>
+      <w:pPr>
+        <w:numPr>
+          <w:ilvl w:val="0"/>
+          <w:numId w:val="73"/>
+        </w:numPr>
+      </w:pPr>
+      <w:r>
+        <w:rPr>
+          <w:b/>
+          <w:bCs/>
+        </w:rPr>
+        <w:t>Cross-session identity modeling</w:t>
+      </w:r>
+      <w:r>
+        <w:t xml:space="preserve"> ("the user is a person who…").</w:t>
+      </w:r>
+    </w:p>
+    <w:p>
+      <w:pPr>
+        <w:numPr>
+          <w:ilvl w:val="0"/>
+          <w:numId w:val="73"/>
+        </w:numPr>
+      </w:pPr>
+      <w:r>
+        <w:rPr>
+          <w:b/>
+          <w:bCs/>
+        </w:rPr>
+        <w:t>Auto-generated reflections written to disk.</w:t>
+      </w:r>
+    </w:p>
+    <w:p>
+      <w:pPr>
+        <w:numPr>
+          <w:ilvl w:val="0"/>
+          <w:numId w:val="73"/>
+        </w:numPr>
+      </w:pPr>
+      <w:r>
+        <w:rPr>
+          <w:b/>
+          <w:bCs/>
+        </w:rPr>
+        <w:t>Goal auto-detection from conversation.</w:t>
+      </w:r>
+    </w:p>
+    <w:p>
+      <w:pPr>
+        <w:numPr>
+          <w:ilvl w:val="0"/>
+          <w:numId w:val="73"/>
+        </w:numPr>
+      </w:pPr>
+      <w:r>
+        <w:rPr>
+          <w:b/>
+          <w:bCs/>
+        </w:rPr>
+        <w:t>Weighting writes into the candidate table.</w:t>
+      </w:r>
+    </w:p>
+    <w:p>
+      <w:pPr>
+        <w:numPr>
+          <w:ilvl w:val="0"/>
+          <w:numId w:val="73"/>
+        </w:numPr>
+      </w:pPr>
+      <w:r>
+        <w:rPr>
+          <w:b/>
+          <w:bCs/>
+        </w:rPr>
+        <w:t>Any UI element that simulates personhood, care, or memory-as-relationship.</w:t>
+      </w:r>
+    </w:p>
+    <w:p>
+      <w:pPr>
+        <w:rPr>
+          <w:b/>
+          <w:bCs/>
+        </w:rPr>
+      </w:pPr>
+      <w:r>
+        <w:rPr>
+          <w:b/>
+          <w:bCs/>
+        </w:rPr>
+        <w:lastRenderedPageBreak/>
+        <w:t>9. Recommended Codex Implementation Sequence</w:t>
+      </w:r>
+    </w:p>
+    <w:p>
+      <w:pPr>
+        <w:numPr>
+          <w:ilvl w:val="0"/>
+          <w:numId w:val="74"/>
+        </w:numPr>
+      </w:pPr>
+      <w:r>
+        <w:rPr>
+          <w:b/>
+          <w:bCs/>
+        </w:rPr>
+        <w:t>3D-9 Consent manifest</w:t>
+      </w:r>
+      <w:r>
+        <w:t xml:space="preserve"> — schema, loader, gate decorator, UI toggle. Ship alone; verify audit emission.</w:t>
+      </w:r>
+    </w:p>
+    <w:p>
+      <w:pPr>
+        <w:numPr>
+          <w:ilvl w:val="0"/>
+          <w:numId w:val="74"/>
+        </w:numPr>
+      </w:pPr>
+      <w:r>
+        <w:rPr>
+          <w:b/>
+          <w:bCs/>
+        </w:rPr>
+        <w:t>3D-1 Preference Ledger</w:t>
+      </w:r>
+      <w:r>
+        <w:t xml:space="preserve"> — append-only table + read API + UI. No consumers yet.</w:t>
+      </w:r>
+    </w:p>
+    <w:p>
+      <w:pPr>
+        <w:numPr>
+          <w:ilvl w:val="0"/>
+          <w:numId w:val="74"/>
+        </w:numPr>
+      </w:pPr>
+      <w:r>
+        <w:rPr>
+          <w:b/>
+          <w:bCs/>
+        </w:rPr>
+        <w:t>3D-2 Goal Continuity Store</w:t>
+      </w:r>
+      <w:r>
+        <w:t xml:space="preserve"> — table + CRUD + UI. Status transitions require confirm.</w:t>
+      </w:r>
+    </w:p>
+    <w:p>
+      <w:pPr>
+        <w:numPr>
+          <w:ilvl w:val="0"/>
+          <w:numId w:val="74"/>
+        </w:numPr>
+      </w:pPr>
+      <w:r>
+        <w:rPr>
+          <w:b/>
+          <w:bCs/>
+        </w:rPr>
+        <w:t>3D-3 Timeline Index</w:t>
+      </w:r>
+      <w:r>
+        <w:t xml:space="preserve"> — read-only projection endpoint + UI view.</w:t>
+      </w:r>
+    </w:p>
+    <w:p>
+      <w:pPr>
+        <w:numPr>
+          <w:ilvl w:val="0"/>
+          <w:numId w:val="74"/>
+        </w:numPr>
+      </w:pPr>
+      <w:r>
+        <w:rPr>
+          <w:b/>
+          <w:bCs/>
+        </w:rPr>
+        <w:t>3D-4 Memory Weighting view</w:t>
+      </w:r>
+      <w:r>
+        <w:t xml:space="preserve"> — pure function + view; assert no writes to candidates; weighting </w:t>
+      </w:r>
+      <w:r>
+        <w:rPr>
+          <w:i/>
+          <w:iCs/>
+        </w:rPr>
+        <w:t>off</w:t>
+      </w:r>
+      <w:r>
+        <w:t xml:space="preserve"> in retrieval ranker.</w:t>
+      </w:r>
+    </w:p>
+    <w:p>
+      <w:pPr>
+        <w:numPr>
+          <w:ilvl w:val="0"/>
+          <w:numId w:val="74"/>
+        </w:numPr>
+      </w:pPr>
+      <w:r>
+        <w:rPr>
+          <w:b/>
+          <w:bCs/>
+        </w:rPr>
+        <w:t>3D-5 Conversation Curator</w:t>
+      </w:r>
+      <w:r>
+        <w:t xml:space="preserve"> — UI over existing summaries/candidates; all edits through audit log.</w:t>
+      </w:r>
+    </w:p>
+    <w:p>
+      <w:pPr>
+        <w:numPr>
+          <w:ilvl w:val="0"/>
+          <w:numId w:val="74"/>
+        </w:numPr>
+      </w:pPr>
+      <w:r>
+        <w:rPr>
+          <w:b/>
+          <w:bCs/>
+        </w:rPr>
+        <w:t>3D-8 Human Review Queue</w:t>
+      </w:r>
+      <w:r>
+        <w:t xml:space="preserve"> — unify pending items from 3D-2, 3D-4, 3D-5 into one inbox.</w:t>
+      </w:r>
+    </w:p>
+    <w:p>
+      <w:pPr>
+        <w:numPr>
+          <w:ilvl w:val="0"/>
+          <w:numId w:val="74"/>
+        </w:numPr>
+      </w:pPr>
+      <w:r>
+        <w:rPr>
+          <w:b/>
+          <w:bCs/>
+        </w:rPr>
+        <w:t>3D-6 Reflection Prompts</w:t>
+      </w:r>
+      <w:r>
+        <w:t xml:space="preserve"> — manual endpoint, escaped templates, no scheduler.</w:t>
+      </w:r>
+    </w:p>
+    <w:p>
+      <w:pPr>
+        <w:numPr>
+          <w:ilvl w:val="0"/>
+          <w:numId w:val="74"/>
+        </w:numPr>
+      </w:pPr>
+      <w:r>
+        <w:rPr>
+          <w:b/>
+          <w:bCs/>
+        </w:rPr>
+        <w:t>3D-7 Keeper interface</w:t>
+      </w:r>
+      <w:r>
+        <w:t xml:space="preserve"> — abstract contract + registry that refuses unlisted Keepers. Zero concrete classes.</w:t>
+      </w:r>
+    </w:p>
+    <w:p>
+      <w:r>
+        <w:t>Each step ships behind its own consent flag, with audit-log assertions in tests before merging the next.</w:t>
+      </w:r>
+    </w:p>
+    <w:p>
+      <w:r>
+        <w:pict w14:anchorId="5DA76044">
+          <v:rect id="_x0000_i1049" style="width:0;height:1.5pt" o:hralign="center" o:hrstd="t" o:hr="t" fillcolor="#a0a0a0" stroked="f"/>
+        </w:pict>
+      </w:r>
+    </w:p>
+    <w:p>
+      <w:r>
+        <w:t xml:space="preserve">End state of 3D: a fully </w:t>
+      </w:r>
+      <w:r>
+        <w:rPr>
+          <w:i/>
+          <w:iCs/>
+        </w:rPr>
+        <w:t>inert</w:t>
+      </w:r>
+      <w:r>
+        <w:t xml:space="preserve"> personal intelligence layer — every capability exists, nothing acts on its own, the user holds every switch. Phase 3E can then debate which Keepers (if any) earn the right to run.</w:t>
       </w:r>
     </w:p>
     <w:p/>
@@ -13115,6 +14593,155 @@
     </w:lvl>
   </w:abstractNum>
   <w:abstractNum w:abstractNumId="3" w15:restartNumberingAfterBreak="0">
+    <w:nsid w:val="09A232F3"/>
+    <w:multiLevelType w:val="multilevel"/>
+    <w:tmpl w:val="9A088F5E"/>
+    <w:lvl w:ilvl="0">
+      <w:start w:val="1"/>
+      <w:numFmt w:val="bullet"/>
+      <w:lvlText w:val=""/>
+      <w:lvlJc w:val="left"/>
+      <w:pPr>
+        <w:tabs>
+          <w:tab w:val="num" w:pos="720"/>
+        </w:tabs>
+        <w:ind w:left="720" w:hanging="360"/>
+      </w:pPr>
+      <w:rPr>
+        <w:rFonts w:ascii="Symbol" w:hAnsi="Symbol" w:hint="default"/>
+        <w:sz w:val="20"/>
+      </w:rPr>
+    </w:lvl>
+    <w:lvl w:ilvl="1" w:tentative="1">
+      <w:start w:val="1"/>
+      <w:numFmt w:val="bullet"/>
+      <w:lvlText w:val="o"/>
+      <w:lvlJc w:val="left"/>
+      <w:pPr>
+        <w:tabs>
+          <w:tab w:val="num" w:pos="1440"/>
+        </w:tabs>
+        <w:ind w:left="1440" w:hanging="360"/>
+      </w:pPr>
+      <w:rPr>
+        <w:rFonts w:ascii="Courier New" w:hAnsi="Courier New" w:hint="default"/>
+        <w:sz w:val="20"/>
+      </w:rPr>
+    </w:lvl>
+    <w:lvl w:ilvl="2" w:tentative="1">
+      <w:start w:val="1"/>
+      <w:numFmt w:val="bullet"/>
+      <w:lvlText w:val=""/>
+      <w:lvlJc w:val="left"/>
+      <w:pPr>
+        <w:tabs>
+          <w:tab w:val="num" w:pos="2160"/>
+        </w:tabs>
+        <w:ind w:left="2160" w:hanging="360"/>
+      </w:pPr>
+      <w:rPr>
+        <w:rFonts w:ascii="Wingdings" w:hAnsi="Wingdings" w:hint="default"/>
+        <w:sz w:val="20"/>
+      </w:rPr>
+    </w:lvl>
+    <w:lvl w:ilvl="3" w:tentative="1">
+      <w:start w:val="1"/>
+      <w:numFmt w:val="bullet"/>
+      <w:lvlText w:val=""/>
+      <w:lvlJc w:val="left"/>
+      <w:pPr>
+        <w:tabs>
+          <w:tab w:val="num" w:pos="2880"/>
+        </w:tabs>
+        <w:ind w:left="2880" w:hanging="360"/>
+      </w:pPr>
+      <w:rPr>
+        <w:rFonts w:ascii="Wingdings" w:hAnsi="Wingdings" w:hint="default"/>
+        <w:sz w:val="20"/>
+      </w:rPr>
+    </w:lvl>
+    <w:lvl w:ilvl="4" w:tentative="1">
+      <w:start w:val="1"/>
+      <w:numFmt w:val="bullet"/>
+      <w:lvlText w:val=""/>
+      <w:lvlJc w:val="left"/>
+      <w:pPr>
+        <w:tabs>
+          <w:tab w:val="num" w:pos="3600"/>
+        </w:tabs>
+        <w:ind w:left="3600" w:hanging="360"/>
+      </w:pPr>
+      <w:rPr>
+        <w:rFonts w:ascii="Wingdings" w:hAnsi="Wingdings" w:hint="default"/>
+        <w:sz w:val="20"/>
+      </w:rPr>
+    </w:lvl>
+    <w:lvl w:ilvl="5" w:tentative="1">
+      <w:start w:val="1"/>
+      <w:numFmt w:val="bullet"/>
+      <w:lvlText w:val=""/>
+      <w:lvlJc w:val="left"/>
+      <w:pPr>
+        <w:tabs>
+          <w:tab w:val="num" w:pos="4320"/>
+        </w:tabs>
+        <w:ind w:left="4320" w:hanging="360"/>
+      </w:pPr>
+      <w:rPr>
+        <w:rFonts w:ascii="Wingdings" w:hAnsi="Wingdings" w:hint="default"/>
+        <w:sz w:val="20"/>
+      </w:rPr>
+    </w:lvl>
+    <w:lvl w:ilvl="6" w:tentative="1">
+      <w:start w:val="1"/>
+      <w:numFmt w:val="bullet"/>
+      <w:lvlText w:val=""/>
+      <w:lvlJc w:val="left"/>
+      <w:pPr>
+        <w:tabs>
+          <w:tab w:val="num" w:pos="5040"/>
+        </w:tabs>
+        <w:ind w:left="5040" w:hanging="360"/>
+      </w:pPr>
+      <w:rPr>
+        <w:rFonts w:ascii="Wingdings" w:hAnsi="Wingdings" w:hint="default"/>
+        <w:sz w:val="20"/>
+      </w:rPr>
+    </w:lvl>
+    <w:lvl w:ilvl="7" w:tentative="1">
+      <w:start w:val="1"/>
+      <w:numFmt w:val="bullet"/>
+      <w:lvlText w:val=""/>
+      <w:lvlJc w:val="left"/>
+      <w:pPr>
+        <w:tabs>
+          <w:tab w:val="num" w:pos="5760"/>
+        </w:tabs>
+        <w:ind w:left="5760" w:hanging="360"/>
+      </w:pPr>
+      <w:rPr>
+        <w:rFonts w:ascii="Wingdings" w:hAnsi="Wingdings" w:hint="default"/>
+        <w:sz w:val="20"/>
+      </w:rPr>
+    </w:lvl>
+    <w:lvl w:ilvl="8" w:tentative="1">
+      <w:start w:val="1"/>
+      <w:numFmt w:val="bullet"/>
+      <w:lvlText w:val=""/>
+      <w:lvlJc w:val="left"/>
+      <w:pPr>
+        <w:tabs>
+          <w:tab w:val="num" w:pos="6480"/>
+        </w:tabs>
+        <w:ind w:left="6480" w:hanging="360"/>
+      </w:pPr>
+      <w:rPr>
+        <w:rFonts w:ascii="Wingdings" w:hAnsi="Wingdings" w:hint="default"/>
+        <w:sz w:val="20"/>
+      </w:rPr>
+    </w:lvl>
+  </w:abstractNum>
+  <w:abstractNum w:abstractNumId="4" w15:restartNumberingAfterBreak="0">
     <w:nsid w:val="0A99524E"/>
     <w:multiLevelType w:val="multilevel"/>
     <w:tmpl w:val="A7E22600"/>
@@ -13263,7 +14890,7 @@
       </w:rPr>
     </w:lvl>
   </w:abstractNum>
-  <w:abstractNum w:abstractNumId="4" w15:restartNumberingAfterBreak="0">
+  <w:abstractNum w:abstractNumId="5" w15:restartNumberingAfterBreak="0">
     <w:nsid w:val="0B3D5F70"/>
     <w:multiLevelType w:val="multilevel"/>
     <w:tmpl w:val="517A17B4"/>
@@ -13412,7 +15039,7 @@
       </w:rPr>
     </w:lvl>
   </w:abstractNum>
-  <w:abstractNum w:abstractNumId="5" w15:restartNumberingAfterBreak="0">
+  <w:abstractNum w:abstractNumId="6" w15:restartNumberingAfterBreak="0">
     <w:nsid w:val="115B149B"/>
     <w:multiLevelType w:val="multilevel"/>
     <w:tmpl w:val="44AE5096"/>
@@ -13561,7 +15188,7 @@
       </w:rPr>
     </w:lvl>
   </w:abstractNum>
-  <w:abstractNum w:abstractNumId="6" w15:restartNumberingAfterBreak="0">
+  <w:abstractNum w:abstractNumId="7" w15:restartNumberingAfterBreak="0">
     <w:nsid w:val="13531BF6"/>
     <w:multiLevelType w:val="multilevel"/>
     <w:tmpl w:val="EA0C54B4"/>
@@ -13710,7 +15337,7 @@
       </w:rPr>
     </w:lvl>
   </w:abstractNum>
-  <w:abstractNum w:abstractNumId="7" w15:restartNumberingAfterBreak="0">
+  <w:abstractNum w:abstractNumId="8" w15:restartNumberingAfterBreak="0">
     <w:nsid w:val="139439FD"/>
     <w:multiLevelType w:val="multilevel"/>
     <w:tmpl w:val="A326701E"/>
@@ -13859,7 +15486,7 @@
       </w:rPr>
     </w:lvl>
   </w:abstractNum>
-  <w:abstractNum w:abstractNumId="8" w15:restartNumberingAfterBreak="0">
+  <w:abstractNum w:abstractNumId="9" w15:restartNumberingAfterBreak="0">
     <w:nsid w:val="156D1824"/>
     <w:multiLevelType w:val="multilevel"/>
     <w:tmpl w:val="9536BF72"/>
@@ -14008,7 +15635,7 @@
       </w:rPr>
     </w:lvl>
   </w:abstractNum>
-  <w:abstractNum w:abstractNumId="9" w15:restartNumberingAfterBreak="0">
+  <w:abstractNum w:abstractNumId="10" w15:restartNumberingAfterBreak="0">
     <w:nsid w:val="17A2539C"/>
     <w:multiLevelType w:val="multilevel"/>
     <w:tmpl w:val="AF6E9CBC"/>
@@ -14157,7 +15784,7 @@
       </w:rPr>
     </w:lvl>
   </w:abstractNum>
-  <w:abstractNum w:abstractNumId="10" w15:restartNumberingAfterBreak="0">
+  <w:abstractNum w:abstractNumId="11" w15:restartNumberingAfterBreak="0">
     <w:nsid w:val="192F5FEE"/>
     <w:multiLevelType w:val="multilevel"/>
     <w:tmpl w:val="D868BB1A"/>
@@ -14306,7 +15933,7 @@
       </w:rPr>
     </w:lvl>
   </w:abstractNum>
-  <w:abstractNum w:abstractNumId="11" w15:restartNumberingAfterBreak="0">
+  <w:abstractNum w:abstractNumId="12" w15:restartNumberingAfterBreak="0">
     <w:nsid w:val="1ACE0B4B"/>
     <w:multiLevelType w:val="multilevel"/>
     <w:tmpl w:val="C15A5154"/>
@@ -14455,7 +16082,7 @@
       </w:rPr>
     </w:lvl>
   </w:abstractNum>
-  <w:abstractNum w:abstractNumId="12" w15:restartNumberingAfterBreak="0">
+  <w:abstractNum w:abstractNumId="13" w15:restartNumberingAfterBreak="0">
     <w:nsid w:val="1B293007"/>
     <w:multiLevelType w:val="multilevel"/>
     <w:tmpl w:val="73EEE01A"/>
@@ -14604,7 +16231,7 @@
       </w:rPr>
     </w:lvl>
   </w:abstractNum>
-  <w:abstractNum w:abstractNumId="13" w15:restartNumberingAfterBreak="0">
+  <w:abstractNum w:abstractNumId="14" w15:restartNumberingAfterBreak="0">
     <w:nsid w:val="1B73403D"/>
     <w:multiLevelType w:val="multilevel"/>
     <w:tmpl w:val="703E7B44"/>
@@ -14753,7 +16380,7 @@
       </w:rPr>
     </w:lvl>
   </w:abstractNum>
-  <w:abstractNum w:abstractNumId="14" w15:restartNumberingAfterBreak="0">
+  <w:abstractNum w:abstractNumId="15" w15:restartNumberingAfterBreak="0">
     <w:nsid w:val="1F1F1379"/>
     <w:multiLevelType w:val="multilevel"/>
     <w:tmpl w:val="6C18730A"/>
@@ -14902,7 +16529,7 @@
       </w:rPr>
     </w:lvl>
   </w:abstractNum>
-  <w:abstractNum w:abstractNumId="15" w15:restartNumberingAfterBreak="0">
+  <w:abstractNum w:abstractNumId="16" w15:restartNumberingAfterBreak="0">
     <w:nsid w:val="2178356D"/>
     <w:multiLevelType w:val="multilevel"/>
     <w:tmpl w:val="98EAC22A"/>
@@ -15051,7 +16678,7 @@
       </w:rPr>
     </w:lvl>
   </w:abstractNum>
-  <w:abstractNum w:abstractNumId="16" w15:restartNumberingAfterBreak="0">
+  <w:abstractNum w:abstractNumId="17" w15:restartNumberingAfterBreak="0">
     <w:nsid w:val="21F7270F"/>
     <w:multiLevelType w:val="multilevel"/>
     <w:tmpl w:val="4A5AF3DC"/>
@@ -15200,7 +16827,156 @@
       </w:rPr>
     </w:lvl>
   </w:abstractNum>
-  <w:abstractNum w:abstractNumId="17" w15:restartNumberingAfterBreak="0">
+  <w:abstractNum w:abstractNumId="18" w15:restartNumberingAfterBreak="0">
+    <w:nsid w:val="26862F5A"/>
+    <w:multiLevelType w:val="multilevel"/>
+    <w:tmpl w:val="811693EC"/>
+    <w:lvl w:ilvl="0">
+      <w:start w:val="1"/>
+      <w:numFmt w:val="bullet"/>
+      <w:lvlText w:val=""/>
+      <w:lvlJc w:val="left"/>
+      <w:pPr>
+        <w:tabs>
+          <w:tab w:val="num" w:pos="720"/>
+        </w:tabs>
+        <w:ind w:left="720" w:hanging="360"/>
+      </w:pPr>
+      <w:rPr>
+        <w:rFonts w:ascii="Symbol" w:hAnsi="Symbol" w:hint="default"/>
+        <w:sz w:val="20"/>
+      </w:rPr>
+    </w:lvl>
+    <w:lvl w:ilvl="1" w:tentative="1">
+      <w:start w:val="1"/>
+      <w:numFmt w:val="bullet"/>
+      <w:lvlText w:val="o"/>
+      <w:lvlJc w:val="left"/>
+      <w:pPr>
+        <w:tabs>
+          <w:tab w:val="num" w:pos="1440"/>
+        </w:tabs>
+        <w:ind w:left="1440" w:hanging="360"/>
+      </w:pPr>
+      <w:rPr>
+        <w:rFonts w:ascii="Courier New" w:hAnsi="Courier New" w:hint="default"/>
+        <w:sz w:val="20"/>
+      </w:rPr>
+    </w:lvl>
+    <w:lvl w:ilvl="2" w:tentative="1">
+      <w:start w:val="1"/>
+      <w:numFmt w:val="bullet"/>
+      <w:lvlText w:val=""/>
+      <w:lvlJc w:val="left"/>
+      <w:pPr>
+        <w:tabs>
+          <w:tab w:val="num" w:pos="2160"/>
+        </w:tabs>
+        <w:ind w:left="2160" w:hanging="360"/>
+      </w:pPr>
+      <w:rPr>
+        <w:rFonts w:ascii="Wingdings" w:hAnsi="Wingdings" w:hint="default"/>
+        <w:sz w:val="20"/>
+      </w:rPr>
+    </w:lvl>
+    <w:lvl w:ilvl="3" w:tentative="1">
+      <w:start w:val="1"/>
+      <w:numFmt w:val="bullet"/>
+      <w:lvlText w:val=""/>
+      <w:lvlJc w:val="left"/>
+      <w:pPr>
+        <w:tabs>
+          <w:tab w:val="num" w:pos="2880"/>
+        </w:tabs>
+        <w:ind w:left="2880" w:hanging="360"/>
+      </w:pPr>
+      <w:rPr>
+        <w:rFonts w:ascii="Wingdings" w:hAnsi="Wingdings" w:hint="default"/>
+        <w:sz w:val="20"/>
+      </w:rPr>
+    </w:lvl>
+    <w:lvl w:ilvl="4" w:tentative="1">
+      <w:start w:val="1"/>
+      <w:numFmt w:val="bullet"/>
+      <w:lvlText w:val=""/>
+      <w:lvlJc w:val="left"/>
+      <w:pPr>
+        <w:tabs>
+          <w:tab w:val="num" w:pos="3600"/>
+        </w:tabs>
+        <w:ind w:left="3600" w:hanging="360"/>
+      </w:pPr>
+      <w:rPr>
+        <w:rFonts w:ascii="Wingdings" w:hAnsi="Wingdings" w:hint="default"/>
+        <w:sz w:val="20"/>
+      </w:rPr>
+    </w:lvl>
+    <w:lvl w:ilvl="5" w:tentative="1">
+      <w:start w:val="1"/>
+      <w:numFmt w:val="bullet"/>
+      <w:lvlText w:val=""/>
+      <w:lvlJc w:val="left"/>
+      <w:pPr>
+        <w:tabs>
+          <w:tab w:val="num" w:pos="4320"/>
+        </w:tabs>
+        <w:ind w:left="4320" w:hanging="360"/>
+      </w:pPr>
+      <w:rPr>
+        <w:rFonts w:ascii="Wingdings" w:hAnsi="Wingdings" w:hint="default"/>
+        <w:sz w:val="20"/>
+      </w:rPr>
+    </w:lvl>
+    <w:lvl w:ilvl="6" w:tentative="1">
+      <w:start w:val="1"/>
+      <w:numFmt w:val="bullet"/>
+      <w:lvlText w:val=""/>
+      <w:lvlJc w:val="left"/>
+      <w:pPr>
+        <w:tabs>
+          <w:tab w:val="num" w:pos="5040"/>
+        </w:tabs>
+        <w:ind w:left="5040" w:hanging="360"/>
+      </w:pPr>
+      <w:rPr>
+        <w:rFonts w:ascii="Wingdings" w:hAnsi="Wingdings" w:hint="default"/>
+        <w:sz w:val="20"/>
+      </w:rPr>
+    </w:lvl>
+    <w:lvl w:ilvl="7" w:tentative="1">
+      <w:start w:val="1"/>
+      <w:numFmt w:val="bullet"/>
+      <w:lvlText w:val=""/>
+      <w:lvlJc w:val="left"/>
+      <w:pPr>
+        <w:tabs>
+          <w:tab w:val="num" w:pos="5760"/>
+        </w:tabs>
+        <w:ind w:left="5760" w:hanging="360"/>
+      </w:pPr>
+      <w:rPr>
+        <w:rFonts w:ascii="Wingdings" w:hAnsi="Wingdings" w:hint="default"/>
+        <w:sz w:val="20"/>
+      </w:rPr>
+    </w:lvl>
+    <w:lvl w:ilvl="8" w:tentative="1">
+      <w:start w:val="1"/>
+      <w:numFmt w:val="bullet"/>
+      <w:lvlText w:val=""/>
+      <w:lvlJc w:val="left"/>
+      <w:pPr>
+        <w:tabs>
+          <w:tab w:val="num" w:pos="6480"/>
+        </w:tabs>
+        <w:ind w:left="6480" w:hanging="360"/>
+      </w:pPr>
+      <w:rPr>
+        <w:rFonts w:ascii="Wingdings" w:hAnsi="Wingdings" w:hint="default"/>
+        <w:sz w:val="20"/>
+      </w:rPr>
+    </w:lvl>
+  </w:abstractNum>
+  <w:abstractNum w:abstractNumId="19" w15:restartNumberingAfterBreak="0">
     <w:nsid w:val="282304BA"/>
     <w:multiLevelType w:val="multilevel"/>
     <w:tmpl w:val="017AE620"/>
@@ -15349,7 +17125,7 @@
       </w:rPr>
     </w:lvl>
   </w:abstractNum>
-  <w:abstractNum w:abstractNumId="18" w15:restartNumberingAfterBreak="0">
+  <w:abstractNum w:abstractNumId="20" w15:restartNumberingAfterBreak="0">
     <w:nsid w:val="28BE3FCE"/>
     <w:multiLevelType w:val="multilevel"/>
     <w:tmpl w:val="F6ACC8F4"/>
@@ -15498,7 +17274,7 @@
       </w:rPr>
     </w:lvl>
   </w:abstractNum>
-  <w:abstractNum w:abstractNumId="19" w15:restartNumberingAfterBreak="0">
+  <w:abstractNum w:abstractNumId="21" w15:restartNumberingAfterBreak="0">
     <w:nsid w:val="2A07000B"/>
     <w:multiLevelType w:val="multilevel"/>
     <w:tmpl w:val="BA26CAF8"/>
@@ -15647,7 +17423,7 @@
       </w:rPr>
     </w:lvl>
   </w:abstractNum>
-  <w:abstractNum w:abstractNumId="20" w15:restartNumberingAfterBreak="0">
+  <w:abstractNum w:abstractNumId="22" w15:restartNumberingAfterBreak="0">
     <w:nsid w:val="2A1B0E16"/>
     <w:multiLevelType w:val="multilevel"/>
     <w:tmpl w:val="0AD85360"/>
@@ -15796,7 +17572,7 @@
       </w:rPr>
     </w:lvl>
   </w:abstractNum>
-  <w:abstractNum w:abstractNumId="21" w15:restartNumberingAfterBreak="0">
+  <w:abstractNum w:abstractNumId="23" w15:restartNumberingAfterBreak="0">
     <w:nsid w:val="2B0F0846"/>
     <w:multiLevelType w:val="multilevel"/>
     <w:tmpl w:val="07F8FDAC"/>
@@ -15945,7 +17721,7 @@
       </w:rPr>
     </w:lvl>
   </w:abstractNum>
-  <w:abstractNum w:abstractNumId="22" w15:restartNumberingAfterBreak="0">
+  <w:abstractNum w:abstractNumId="24" w15:restartNumberingAfterBreak="0">
     <w:nsid w:val="2C591F6F"/>
     <w:multiLevelType w:val="multilevel"/>
     <w:tmpl w:val="41DCE580"/>
@@ -16094,7 +17870,305 @@
       </w:rPr>
     </w:lvl>
   </w:abstractNum>
-  <w:abstractNum w:abstractNumId="23" w15:restartNumberingAfterBreak="0">
+  <w:abstractNum w:abstractNumId="25" w15:restartNumberingAfterBreak="0">
+    <w:nsid w:val="2CA623BA"/>
+    <w:multiLevelType w:val="multilevel"/>
+    <w:tmpl w:val="92F09DA0"/>
+    <w:lvl w:ilvl="0">
+      <w:start w:val="1"/>
+      <w:numFmt w:val="bullet"/>
+      <w:lvlText w:val=""/>
+      <w:lvlJc w:val="left"/>
+      <w:pPr>
+        <w:tabs>
+          <w:tab w:val="num" w:pos="720"/>
+        </w:tabs>
+        <w:ind w:left="720" w:hanging="360"/>
+      </w:pPr>
+      <w:rPr>
+        <w:rFonts w:ascii="Symbol" w:hAnsi="Symbol" w:hint="default"/>
+        <w:sz w:val="20"/>
+      </w:rPr>
+    </w:lvl>
+    <w:lvl w:ilvl="1" w:tentative="1">
+      <w:start w:val="1"/>
+      <w:numFmt w:val="bullet"/>
+      <w:lvlText w:val="o"/>
+      <w:lvlJc w:val="left"/>
+      <w:pPr>
+        <w:tabs>
+          <w:tab w:val="num" w:pos="1440"/>
+        </w:tabs>
+        <w:ind w:left="1440" w:hanging="360"/>
+      </w:pPr>
+      <w:rPr>
+        <w:rFonts w:ascii="Courier New" w:hAnsi="Courier New" w:hint="default"/>
+        <w:sz w:val="20"/>
+      </w:rPr>
+    </w:lvl>
+    <w:lvl w:ilvl="2" w:tentative="1">
+      <w:start w:val="1"/>
+      <w:numFmt w:val="bullet"/>
+      <w:lvlText w:val=""/>
+      <w:lvlJc w:val="left"/>
+      <w:pPr>
+        <w:tabs>
+          <w:tab w:val="num" w:pos="2160"/>
+        </w:tabs>
+        <w:ind w:left="2160" w:hanging="360"/>
+      </w:pPr>
+      <w:rPr>
+        <w:rFonts w:ascii="Wingdings" w:hAnsi="Wingdings" w:hint="default"/>
+        <w:sz w:val="20"/>
+      </w:rPr>
+    </w:lvl>
+    <w:lvl w:ilvl="3" w:tentative="1">
+      <w:start w:val="1"/>
+      <w:numFmt w:val="bullet"/>
+      <w:lvlText w:val=""/>
+      <w:lvlJc w:val="left"/>
+      <w:pPr>
+        <w:tabs>
+          <w:tab w:val="num" w:pos="2880"/>
+        </w:tabs>
+        <w:ind w:left="2880" w:hanging="360"/>
+      </w:pPr>
+      <w:rPr>
+        <w:rFonts w:ascii="Wingdings" w:hAnsi="Wingdings" w:hint="default"/>
+        <w:sz w:val="20"/>
+      </w:rPr>
+    </w:lvl>
+    <w:lvl w:ilvl="4" w:tentative="1">
+      <w:start w:val="1"/>
+      <w:numFmt w:val="bullet"/>
+      <w:lvlText w:val=""/>
+      <w:lvlJc w:val="left"/>
+      <w:pPr>
+        <w:tabs>
+          <w:tab w:val="num" w:pos="3600"/>
+        </w:tabs>
+        <w:ind w:left="3600" w:hanging="360"/>
+      </w:pPr>
+      <w:rPr>
+        <w:rFonts w:ascii="Wingdings" w:hAnsi="Wingdings" w:hint="default"/>
+        <w:sz w:val="20"/>
+      </w:rPr>
+    </w:lvl>
+    <w:lvl w:ilvl="5" w:tentative="1">
+      <w:start w:val="1"/>
+      <w:numFmt w:val="bullet"/>
+      <w:lvlText w:val=""/>
+      <w:lvlJc w:val="left"/>
+      <w:pPr>
+        <w:tabs>
+          <w:tab w:val="num" w:pos="4320"/>
+        </w:tabs>
+        <w:ind w:left="4320" w:hanging="360"/>
+      </w:pPr>
+      <w:rPr>
+        <w:rFonts w:ascii="Wingdings" w:hAnsi="Wingdings" w:hint="default"/>
+        <w:sz w:val="20"/>
+      </w:rPr>
+    </w:lvl>
+    <w:lvl w:ilvl="6" w:tentative="1">
+      <w:start w:val="1"/>
+      <w:numFmt w:val="bullet"/>
+      <w:lvlText w:val=""/>
+      <w:lvlJc w:val="left"/>
+      <w:pPr>
+        <w:tabs>
+          <w:tab w:val="num" w:pos="5040"/>
+        </w:tabs>
+        <w:ind w:left="5040" w:hanging="360"/>
+      </w:pPr>
+      <w:rPr>
+        <w:rFonts w:ascii="Wingdings" w:hAnsi="Wingdings" w:hint="default"/>
+        <w:sz w:val="20"/>
+      </w:rPr>
+    </w:lvl>
+    <w:lvl w:ilvl="7" w:tentative="1">
+      <w:start w:val="1"/>
+      <w:numFmt w:val="bullet"/>
+      <w:lvlText w:val=""/>
+      <w:lvlJc w:val="left"/>
+      <w:pPr>
+        <w:tabs>
+          <w:tab w:val="num" w:pos="5760"/>
+        </w:tabs>
+        <w:ind w:left="5760" w:hanging="360"/>
+      </w:pPr>
+      <w:rPr>
+        <w:rFonts w:ascii="Wingdings" w:hAnsi="Wingdings" w:hint="default"/>
+        <w:sz w:val="20"/>
+      </w:rPr>
+    </w:lvl>
+    <w:lvl w:ilvl="8" w:tentative="1">
+      <w:start w:val="1"/>
+      <w:numFmt w:val="bullet"/>
+      <w:lvlText w:val=""/>
+      <w:lvlJc w:val="left"/>
+      <w:pPr>
+        <w:tabs>
+          <w:tab w:val="num" w:pos="6480"/>
+        </w:tabs>
+        <w:ind w:left="6480" w:hanging="360"/>
+      </w:pPr>
+      <w:rPr>
+        <w:rFonts w:ascii="Wingdings" w:hAnsi="Wingdings" w:hint="default"/>
+        <w:sz w:val="20"/>
+      </w:rPr>
+    </w:lvl>
+  </w:abstractNum>
+  <w:abstractNum w:abstractNumId="26" w15:restartNumberingAfterBreak="0">
+    <w:nsid w:val="30393144"/>
+    <w:multiLevelType w:val="multilevel"/>
+    <w:tmpl w:val="9BA21058"/>
+    <w:lvl w:ilvl="0">
+      <w:start w:val="1"/>
+      <w:numFmt w:val="bullet"/>
+      <w:lvlText w:val=""/>
+      <w:lvlJc w:val="left"/>
+      <w:pPr>
+        <w:tabs>
+          <w:tab w:val="num" w:pos="720"/>
+        </w:tabs>
+        <w:ind w:left="720" w:hanging="360"/>
+      </w:pPr>
+      <w:rPr>
+        <w:rFonts w:ascii="Symbol" w:hAnsi="Symbol" w:hint="default"/>
+        <w:sz w:val="20"/>
+      </w:rPr>
+    </w:lvl>
+    <w:lvl w:ilvl="1" w:tentative="1">
+      <w:start w:val="1"/>
+      <w:numFmt w:val="bullet"/>
+      <w:lvlText w:val="o"/>
+      <w:lvlJc w:val="left"/>
+      <w:pPr>
+        <w:tabs>
+          <w:tab w:val="num" w:pos="1440"/>
+        </w:tabs>
+        <w:ind w:left="1440" w:hanging="360"/>
+      </w:pPr>
+      <w:rPr>
+        <w:rFonts w:ascii="Courier New" w:hAnsi="Courier New" w:hint="default"/>
+        <w:sz w:val="20"/>
+      </w:rPr>
+    </w:lvl>
+    <w:lvl w:ilvl="2" w:tentative="1">
+      <w:start w:val="1"/>
+      <w:numFmt w:val="bullet"/>
+      <w:lvlText w:val=""/>
+      <w:lvlJc w:val="left"/>
+      <w:pPr>
+        <w:tabs>
+          <w:tab w:val="num" w:pos="2160"/>
+        </w:tabs>
+        <w:ind w:left="2160" w:hanging="360"/>
+      </w:pPr>
+      <w:rPr>
+        <w:rFonts w:ascii="Wingdings" w:hAnsi="Wingdings" w:hint="default"/>
+        <w:sz w:val="20"/>
+      </w:rPr>
+    </w:lvl>
+    <w:lvl w:ilvl="3" w:tentative="1">
+      <w:start w:val="1"/>
+      <w:numFmt w:val="bullet"/>
+      <w:lvlText w:val=""/>
+      <w:lvlJc w:val="left"/>
+      <w:pPr>
+        <w:tabs>
+          <w:tab w:val="num" w:pos="2880"/>
+        </w:tabs>
+        <w:ind w:left="2880" w:hanging="360"/>
+      </w:pPr>
+      <w:rPr>
+        <w:rFonts w:ascii="Wingdings" w:hAnsi="Wingdings" w:hint="default"/>
+        <w:sz w:val="20"/>
+      </w:rPr>
+    </w:lvl>
+    <w:lvl w:ilvl="4" w:tentative="1">
+      <w:start w:val="1"/>
+      <w:numFmt w:val="bullet"/>
+      <w:lvlText w:val=""/>
+      <w:lvlJc w:val="left"/>
+      <w:pPr>
+        <w:tabs>
+          <w:tab w:val="num" w:pos="3600"/>
+        </w:tabs>
+        <w:ind w:left="3600" w:hanging="360"/>
+      </w:pPr>
+      <w:rPr>
+        <w:rFonts w:ascii="Wingdings" w:hAnsi="Wingdings" w:hint="default"/>
+        <w:sz w:val="20"/>
+      </w:rPr>
+    </w:lvl>
+    <w:lvl w:ilvl="5" w:tentative="1">
+      <w:start w:val="1"/>
+      <w:numFmt w:val="bullet"/>
+      <w:lvlText w:val=""/>
+      <w:lvlJc w:val="left"/>
+      <w:pPr>
+        <w:tabs>
+          <w:tab w:val="num" w:pos="4320"/>
+        </w:tabs>
+        <w:ind w:left="4320" w:hanging="360"/>
+      </w:pPr>
+      <w:rPr>
+        <w:rFonts w:ascii="Wingdings" w:hAnsi="Wingdings" w:hint="default"/>
+        <w:sz w:val="20"/>
+      </w:rPr>
+    </w:lvl>
+    <w:lvl w:ilvl="6" w:tentative="1">
+      <w:start w:val="1"/>
+      <w:numFmt w:val="bullet"/>
+      <w:lvlText w:val=""/>
+      <w:lvlJc w:val="left"/>
+      <w:pPr>
+        <w:tabs>
+          <w:tab w:val="num" w:pos="5040"/>
+        </w:tabs>
+        <w:ind w:left="5040" w:hanging="360"/>
+      </w:pPr>
+      <w:rPr>
+        <w:rFonts w:ascii="Wingdings" w:hAnsi="Wingdings" w:hint="default"/>
+        <w:sz w:val="20"/>
+      </w:rPr>
+    </w:lvl>
+    <w:lvl w:ilvl="7" w:tentative="1">
+      <w:start w:val="1"/>
+      <w:numFmt w:val="bullet"/>
+      <w:lvlText w:val=""/>
+      <w:lvlJc w:val="left"/>
+      <w:pPr>
+        <w:tabs>
+          <w:tab w:val="num" w:pos="5760"/>
+        </w:tabs>
+        <w:ind w:left="5760" w:hanging="360"/>
+      </w:pPr>
+      <w:rPr>
+        <w:rFonts w:ascii="Wingdings" w:hAnsi="Wingdings" w:hint="default"/>
+        <w:sz w:val="20"/>
+      </w:rPr>
+    </w:lvl>
+    <w:lvl w:ilvl="8" w:tentative="1">
+      <w:start w:val="1"/>
+      <w:numFmt w:val="bullet"/>
+      <w:lvlText w:val=""/>
+      <w:lvlJc w:val="left"/>
+      <w:pPr>
+        <w:tabs>
+          <w:tab w:val="num" w:pos="6480"/>
+        </w:tabs>
+        <w:ind w:left="6480" w:hanging="360"/>
+      </w:pPr>
+      <w:rPr>
+        <w:rFonts w:ascii="Wingdings" w:hAnsi="Wingdings" w:hint="default"/>
+        <w:sz w:val="20"/>
+      </w:rPr>
+    </w:lvl>
+  </w:abstractNum>
+  <w:abstractNum w:abstractNumId="27" w15:restartNumberingAfterBreak="0">
     <w:nsid w:val="32EB1D58"/>
     <w:multiLevelType w:val="multilevel"/>
     <w:tmpl w:val="C6702F2E"/>
@@ -16243,7 +18317,7 @@
       </w:rPr>
     </w:lvl>
   </w:abstractNum>
-  <w:abstractNum w:abstractNumId="24" w15:restartNumberingAfterBreak="0">
+  <w:abstractNum w:abstractNumId="28" w15:restartNumberingAfterBreak="0">
     <w:nsid w:val="33E91C6A"/>
     <w:multiLevelType w:val="multilevel"/>
     <w:tmpl w:val="A746B9C8"/>
@@ -16392,7 +18466,7 @@
       </w:rPr>
     </w:lvl>
   </w:abstractNum>
-  <w:abstractNum w:abstractNumId="25" w15:restartNumberingAfterBreak="0">
+  <w:abstractNum w:abstractNumId="29" w15:restartNumberingAfterBreak="0">
     <w:nsid w:val="34FA2B37"/>
     <w:multiLevelType w:val="multilevel"/>
     <w:tmpl w:val="12C8FD02"/>
@@ -16541,7 +18615,7 @@
       </w:rPr>
     </w:lvl>
   </w:abstractNum>
-  <w:abstractNum w:abstractNumId="26" w15:restartNumberingAfterBreak="0">
+  <w:abstractNum w:abstractNumId="30" w15:restartNumberingAfterBreak="0">
     <w:nsid w:val="38C22A11"/>
     <w:multiLevelType w:val="multilevel"/>
     <w:tmpl w:val="F2880278"/>
@@ -16690,7 +18764,120 @@
       </w:rPr>
     </w:lvl>
   </w:abstractNum>
-  <w:abstractNum w:abstractNumId="27" w15:restartNumberingAfterBreak="0">
+  <w:abstractNum w:abstractNumId="31" w15:restartNumberingAfterBreak="0">
+    <w:nsid w:val="39967D36"/>
+    <w:multiLevelType w:val="multilevel"/>
+    <w:tmpl w:val="91644536"/>
+    <w:lvl w:ilvl="0">
+      <w:start w:val="1"/>
+      <w:numFmt w:val="decimal"/>
+      <w:lvlText w:val="%1."/>
+      <w:lvlJc w:val="left"/>
+      <w:pPr>
+        <w:tabs>
+          <w:tab w:val="num" w:pos="720"/>
+        </w:tabs>
+        <w:ind w:left="720" w:hanging="360"/>
+      </w:pPr>
+    </w:lvl>
+    <w:lvl w:ilvl="1" w:tentative="1">
+      <w:start w:val="1"/>
+      <w:numFmt w:val="decimal"/>
+      <w:lvlText w:val="%2."/>
+      <w:lvlJc w:val="left"/>
+      <w:pPr>
+        <w:tabs>
+          <w:tab w:val="num" w:pos="1440"/>
+        </w:tabs>
+        <w:ind w:left="1440" w:hanging="360"/>
+      </w:pPr>
+    </w:lvl>
+    <w:lvl w:ilvl="2" w:tentative="1">
+      <w:start w:val="1"/>
+      <w:numFmt w:val="decimal"/>
+      <w:lvlText w:val="%3."/>
+      <w:lvlJc w:val="left"/>
+      <w:pPr>
+        <w:tabs>
+          <w:tab w:val="num" w:pos="2160"/>
+        </w:tabs>
+        <w:ind w:left="2160" w:hanging="360"/>
+      </w:pPr>
+    </w:lvl>
+    <w:lvl w:ilvl="3" w:tentative="1">
+      <w:start w:val="1"/>
+      <w:numFmt w:val="decimal"/>
+      <w:lvlText w:val="%4."/>
+      <w:lvlJc w:val="left"/>
+      <w:pPr>
+        <w:tabs>
+          <w:tab w:val="num" w:pos="2880"/>
+        </w:tabs>
+        <w:ind w:left="2880" w:hanging="360"/>
+      </w:pPr>
+    </w:lvl>
+    <w:lvl w:ilvl="4" w:tentative="1">
+      <w:start w:val="1"/>
+      <w:numFmt w:val="decimal"/>
+      <w:lvlText w:val="%5."/>
+      <w:lvlJc w:val="left"/>
+      <w:pPr>
+        <w:tabs>
+          <w:tab w:val="num" w:pos="3600"/>
+        </w:tabs>
+        <w:ind w:left="3600" w:hanging="360"/>
+      </w:pPr>
+    </w:lvl>
+    <w:lvl w:ilvl="5" w:tentative="1">
+      <w:start w:val="1"/>
+      <w:numFmt w:val="decimal"/>
+      <w:lvlText w:val="%6."/>
+      <w:lvlJc w:val="left"/>
+      <w:pPr>
+        <w:tabs>
+          <w:tab w:val="num" w:pos="4320"/>
+        </w:tabs>
+        <w:ind w:left="4320" w:hanging="360"/>
+      </w:pPr>
+    </w:lvl>
+    <w:lvl w:ilvl="6" w:tentative="1">
+      <w:start w:val="1"/>
+      <w:numFmt w:val="decimal"/>
+      <w:lvlText w:val="%7."/>
+      <w:lvlJc w:val="left"/>
+      <w:pPr>
+        <w:tabs>
+          <w:tab w:val="num" w:pos="5040"/>
+        </w:tabs>
+        <w:ind w:left="5040" w:hanging="360"/>
+      </w:pPr>
+    </w:lvl>
+    <w:lvl w:ilvl="7" w:tentative="1">
+      <w:start w:val="1"/>
+      <w:numFmt w:val="decimal"/>
+      <w:lvlText w:val="%8."/>
+      <w:lvlJc w:val="left"/>
+      <w:pPr>
+        <w:tabs>
+          <w:tab w:val="num" w:pos="5760"/>
+        </w:tabs>
+        <w:ind w:left="5760" w:hanging="360"/>
+      </w:pPr>
+    </w:lvl>
+    <w:lvl w:ilvl="8" w:tentative="1">
+      <w:start w:val="1"/>
+      <w:numFmt w:val="decimal"/>
+      <w:lvlText w:val="%9."/>
+      <w:lvlJc w:val="left"/>
+      <w:pPr>
+        <w:tabs>
+          <w:tab w:val="num" w:pos="6480"/>
+        </w:tabs>
+        <w:ind w:left="6480" w:hanging="360"/>
+      </w:pPr>
+    </w:lvl>
+  </w:abstractNum>
+  <w:abstractNum w:abstractNumId="32" w15:restartNumberingAfterBreak="0">
     <w:nsid w:val="3DF81EB0"/>
     <w:multiLevelType w:val="multilevel"/>
     <w:tmpl w:val="1A64BBD6"/>
@@ -16839,7 +19026,7 @@
       </w:rPr>
     </w:lvl>
   </w:abstractNum>
-  <w:abstractNum w:abstractNumId="28" w15:restartNumberingAfterBreak="0">
+  <w:abstractNum w:abstractNumId="33" w15:restartNumberingAfterBreak="0">
     <w:nsid w:val="40C034D5"/>
     <w:multiLevelType w:val="multilevel"/>
     <w:tmpl w:val="FAD8F4D2"/>
@@ -16988,7 +19175,7 @@
       </w:rPr>
     </w:lvl>
   </w:abstractNum>
-  <w:abstractNum w:abstractNumId="29" w15:restartNumberingAfterBreak="0">
+  <w:abstractNum w:abstractNumId="34" w15:restartNumberingAfterBreak="0">
     <w:nsid w:val="411F0182"/>
     <w:multiLevelType w:val="multilevel"/>
     <w:tmpl w:val="1C6CB41E"/>
@@ -17137,7 +19324,7 @@
       </w:rPr>
     </w:lvl>
   </w:abstractNum>
-  <w:abstractNum w:abstractNumId="30" w15:restartNumberingAfterBreak="0">
+  <w:abstractNum w:abstractNumId="35" w15:restartNumberingAfterBreak="0">
     <w:nsid w:val="42753A0D"/>
     <w:multiLevelType w:val="multilevel"/>
     <w:tmpl w:val="A61AC34C"/>
@@ -17286,7 +19473,7 @@
       </w:rPr>
     </w:lvl>
   </w:abstractNum>
-  <w:abstractNum w:abstractNumId="31" w15:restartNumberingAfterBreak="0">
+  <w:abstractNum w:abstractNumId="36" w15:restartNumberingAfterBreak="0">
     <w:nsid w:val="447D21E6"/>
     <w:multiLevelType w:val="multilevel"/>
     <w:tmpl w:val="72BC1072"/>
@@ -17435,7 +19622,7 @@
       </w:rPr>
     </w:lvl>
   </w:abstractNum>
-  <w:abstractNum w:abstractNumId="32" w15:restartNumberingAfterBreak="0">
+  <w:abstractNum w:abstractNumId="37" w15:restartNumberingAfterBreak="0">
     <w:nsid w:val="451B7120"/>
     <w:multiLevelType w:val="multilevel"/>
     <w:tmpl w:val="739A5384"/>
@@ -17584,7 +19771,7 @@
       </w:rPr>
     </w:lvl>
   </w:abstractNum>
-  <w:abstractNum w:abstractNumId="33" w15:restartNumberingAfterBreak="0">
+  <w:abstractNum w:abstractNumId="38" w15:restartNumberingAfterBreak="0">
     <w:nsid w:val="4731627C"/>
     <w:multiLevelType w:val="multilevel"/>
     <w:tmpl w:val="DFBE2772"/>
@@ -17733,7 +19920,7 @@
       </w:rPr>
     </w:lvl>
   </w:abstractNum>
-  <w:abstractNum w:abstractNumId="34" w15:restartNumberingAfterBreak="0">
+  <w:abstractNum w:abstractNumId="39" w15:restartNumberingAfterBreak="0">
     <w:nsid w:val="4945167B"/>
     <w:multiLevelType w:val="multilevel"/>
     <w:tmpl w:val="20EC736A"/>
@@ -17882,7 +20069,7 @@
       </w:rPr>
     </w:lvl>
   </w:abstractNum>
-  <w:abstractNum w:abstractNumId="35" w15:restartNumberingAfterBreak="0">
+  <w:abstractNum w:abstractNumId="40" w15:restartNumberingAfterBreak="0">
     <w:nsid w:val="4BB81C4B"/>
     <w:multiLevelType w:val="multilevel"/>
     <w:tmpl w:val="3272D11E"/>
@@ -17995,7 +20182,7 @@
       </w:pPr>
     </w:lvl>
   </w:abstractNum>
-  <w:abstractNum w:abstractNumId="36" w15:restartNumberingAfterBreak="0">
+  <w:abstractNum w:abstractNumId="41" w15:restartNumberingAfterBreak="0">
     <w:nsid w:val="4F1224EC"/>
     <w:multiLevelType w:val="multilevel"/>
     <w:tmpl w:val="70F036AA"/>
@@ -18144,7 +20331,7 @@
       </w:rPr>
     </w:lvl>
   </w:abstractNum>
-  <w:abstractNum w:abstractNumId="37" w15:restartNumberingAfterBreak="0">
+  <w:abstractNum w:abstractNumId="42" w15:restartNumberingAfterBreak="0">
     <w:nsid w:val="4F2F0E73"/>
     <w:multiLevelType w:val="multilevel"/>
     <w:tmpl w:val="21DC4BBE"/>
@@ -18257,7 +20444,7 @@
       </w:pPr>
     </w:lvl>
   </w:abstractNum>
-  <w:abstractNum w:abstractNumId="38" w15:restartNumberingAfterBreak="0">
+  <w:abstractNum w:abstractNumId="43" w15:restartNumberingAfterBreak="0">
     <w:nsid w:val="522A4C27"/>
     <w:multiLevelType w:val="multilevel"/>
     <w:tmpl w:val="693EF50E"/>
@@ -18406,7 +20593,7 @@
       </w:rPr>
     </w:lvl>
   </w:abstractNum>
-  <w:abstractNum w:abstractNumId="39" w15:restartNumberingAfterBreak="0">
+  <w:abstractNum w:abstractNumId="44" w15:restartNumberingAfterBreak="0">
     <w:nsid w:val="532577F8"/>
     <w:multiLevelType w:val="multilevel"/>
     <w:tmpl w:val="6F129D44"/>
@@ -18555,7 +20742,7 @@
       </w:rPr>
     </w:lvl>
   </w:abstractNum>
-  <w:abstractNum w:abstractNumId="40" w15:restartNumberingAfterBreak="0">
+  <w:abstractNum w:abstractNumId="45" w15:restartNumberingAfterBreak="0">
     <w:nsid w:val="53A10D01"/>
     <w:multiLevelType w:val="multilevel"/>
     <w:tmpl w:val="136A4318"/>
@@ -18704,7 +20891,7 @@
       </w:rPr>
     </w:lvl>
   </w:abstractNum>
-  <w:abstractNum w:abstractNumId="41" w15:restartNumberingAfterBreak="0">
+  <w:abstractNum w:abstractNumId="46" w15:restartNumberingAfterBreak="0">
     <w:nsid w:val="553A6969"/>
     <w:multiLevelType w:val="multilevel"/>
     <w:tmpl w:val="493AB1CC"/>
@@ -18817,7 +21004,7 @@
       </w:pPr>
     </w:lvl>
   </w:abstractNum>
-  <w:abstractNum w:abstractNumId="42" w15:restartNumberingAfterBreak="0">
+  <w:abstractNum w:abstractNumId="47" w15:restartNumberingAfterBreak="0">
     <w:nsid w:val="55D22AF6"/>
     <w:multiLevelType w:val="multilevel"/>
     <w:tmpl w:val="D6AC1638"/>
@@ -18966,7 +21153,7 @@
       </w:rPr>
     </w:lvl>
   </w:abstractNum>
-  <w:abstractNum w:abstractNumId="43" w15:restartNumberingAfterBreak="0">
+  <w:abstractNum w:abstractNumId="48" w15:restartNumberingAfterBreak="0">
     <w:nsid w:val="57797CB1"/>
     <w:multiLevelType w:val="multilevel"/>
     <w:tmpl w:val="DC10F1D6"/>
@@ -19083,7 +21270,7 @@
       </w:pPr>
     </w:lvl>
   </w:abstractNum>
-  <w:abstractNum w:abstractNumId="44" w15:restartNumberingAfterBreak="0">
+  <w:abstractNum w:abstractNumId="49" w15:restartNumberingAfterBreak="0">
     <w:nsid w:val="58981267"/>
     <w:multiLevelType w:val="multilevel"/>
     <w:tmpl w:val="6944B13E"/>
@@ -19232,7 +21419,7 @@
       </w:rPr>
     </w:lvl>
   </w:abstractNum>
-  <w:abstractNum w:abstractNumId="45" w15:restartNumberingAfterBreak="0">
+  <w:abstractNum w:abstractNumId="50" w15:restartNumberingAfterBreak="0">
     <w:nsid w:val="58BA309E"/>
     <w:multiLevelType w:val="multilevel"/>
     <w:tmpl w:val="977037B4"/>
@@ -19345,7 +21532,7 @@
       </w:pPr>
     </w:lvl>
   </w:abstractNum>
-  <w:abstractNum w:abstractNumId="46" w15:restartNumberingAfterBreak="0">
+  <w:abstractNum w:abstractNumId="51" w15:restartNumberingAfterBreak="0">
     <w:nsid w:val="5A011430"/>
     <w:multiLevelType w:val="multilevel"/>
     <w:tmpl w:val="6D1E81BA"/>
@@ -19494,7 +21681,7 @@
       </w:rPr>
     </w:lvl>
   </w:abstractNum>
-  <w:abstractNum w:abstractNumId="47" w15:restartNumberingAfterBreak="0">
+  <w:abstractNum w:abstractNumId="52" w15:restartNumberingAfterBreak="0">
     <w:nsid w:val="5B2F630D"/>
     <w:multiLevelType w:val="multilevel"/>
     <w:tmpl w:val="8EA02D32"/>
@@ -19643,7 +21830,7 @@
       </w:rPr>
     </w:lvl>
   </w:abstractNum>
-  <w:abstractNum w:abstractNumId="48" w15:restartNumberingAfterBreak="0">
+  <w:abstractNum w:abstractNumId="53" w15:restartNumberingAfterBreak="0">
     <w:nsid w:val="5C3B07DA"/>
     <w:multiLevelType w:val="multilevel"/>
     <w:tmpl w:val="DEB0ACAC"/>
@@ -19792,7 +21979,7 @@
       </w:rPr>
     </w:lvl>
   </w:abstractNum>
-  <w:abstractNum w:abstractNumId="49" w15:restartNumberingAfterBreak="0">
+  <w:abstractNum w:abstractNumId="54" w15:restartNumberingAfterBreak="0">
     <w:nsid w:val="5C625EAF"/>
     <w:multiLevelType w:val="multilevel"/>
     <w:tmpl w:val="4D648BB4"/>
@@ -19941,7 +22128,7 @@
       </w:rPr>
     </w:lvl>
   </w:abstractNum>
-  <w:abstractNum w:abstractNumId="50" w15:restartNumberingAfterBreak="0">
+  <w:abstractNum w:abstractNumId="55" w15:restartNumberingAfterBreak="0">
     <w:nsid w:val="616F2965"/>
     <w:multiLevelType w:val="multilevel"/>
     <w:tmpl w:val="6FF81AE0"/>
@@ -20090,7 +22277,7 @@
       </w:rPr>
     </w:lvl>
   </w:abstractNum>
-  <w:abstractNum w:abstractNumId="51" w15:restartNumberingAfterBreak="0">
+  <w:abstractNum w:abstractNumId="56" w15:restartNumberingAfterBreak="0">
     <w:nsid w:val="61D26E62"/>
     <w:multiLevelType w:val="multilevel"/>
     <w:tmpl w:val="E5DEFFCC"/>
@@ -20239,7 +22426,7 @@
       </w:rPr>
     </w:lvl>
   </w:abstractNum>
-  <w:abstractNum w:abstractNumId="52" w15:restartNumberingAfterBreak="0">
+  <w:abstractNum w:abstractNumId="57" w15:restartNumberingAfterBreak="0">
     <w:nsid w:val="630F7575"/>
     <w:multiLevelType w:val="multilevel"/>
     <w:tmpl w:val="B8FE6F9E"/>
@@ -20388,7 +22575,7 @@
       </w:rPr>
     </w:lvl>
   </w:abstractNum>
-  <w:abstractNum w:abstractNumId="53" w15:restartNumberingAfterBreak="0">
+  <w:abstractNum w:abstractNumId="58" w15:restartNumberingAfterBreak="0">
     <w:nsid w:val="65B53087"/>
     <w:multiLevelType w:val="multilevel"/>
     <w:tmpl w:val="E35A7D86"/>
@@ -20537,7 +22724,7 @@
       </w:rPr>
     </w:lvl>
   </w:abstractNum>
-  <w:abstractNum w:abstractNumId="54" w15:restartNumberingAfterBreak="0">
+  <w:abstractNum w:abstractNumId="59" w15:restartNumberingAfterBreak="0">
     <w:nsid w:val="65D325B1"/>
     <w:multiLevelType w:val="multilevel"/>
     <w:tmpl w:val="6E8EA918"/>
@@ -20686,7 +22873,7 @@
       </w:rPr>
     </w:lvl>
   </w:abstractNum>
-  <w:abstractNum w:abstractNumId="55" w15:restartNumberingAfterBreak="0">
+  <w:abstractNum w:abstractNumId="60" w15:restartNumberingAfterBreak="0">
     <w:nsid w:val="667B3D97"/>
     <w:multiLevelType w:val="multilevel"/>
     <w:tmpl w:val="0778E188"/>
@@ -20799,7 +22986,7 @@
       </w:pPr>
     </w:lvl>
   </w:abstractNum>
-  <w:abstractNum w:abstractNumId="56" w15:restartNumberingAfterBreak="0">
+  <w:abstractNum w:abstractNumId="61" w15:restartNumberingAfterBreak="0">
     <w:nsid w:val="66FF066E"/>
     <w:multiLevelType w:val="multilevel"/>
     <w:tmpl w:val="9E1ACD76"/>
@@ -20912,7 +23099,7 @@
       </w:pPr>
     </w:lvl>
   </w:abstractNum>
-  <w:abstractNum w:abstractNumId="57" w15:restartNumberingAfterBreak="0">
+  <w:abstractNum w:abstractNumId="62" w15:restartNumberingAfterBreak="0">
     <w:nsid w:val="673358A0"/>
     <w:multiLevelType w:val="multilevel"/>
     <w:tmpl w:val="512EC8C2"/>
@@ -21061,7 +23248,7 @@
       </w:rPr>
     </w:lvl>
   </w:abstractNum>
-  <w:abstractNum w:abstractNumId="58" w15:restartNumberingAfterBreak="0">
+  <w:abstractNum w:abstractNumId="63" w15:restartNumberingAfterBreak="0">
     <w:nsid w:val="69965C39"/>
     <w:multiLevelType w:val="multilevel"/>
     <w:tmpl w:val="6596B596"/>
@@ -21174,7 +23361,7 @@
       </w:pPr>
     </w:lvl>
   </w:abstractNum>
-  <w:abstractNum w:abstractNumId="59" w15:restartNumberingAfterBreak="0">
+  <w:abstractNum w:abstractNumId="64" w15:restartNumberingAfterBreak="0">
     <w:nsid w:val="6B305D33"/>
     <w:multiLevelType w:val="multilevel"/>
     <w:tmpl w:val="65F02FEE"/>
@@ -21323,7 +23510,7 @@
       </w:rPr>
     </w:lvl>
   </w:abstractNum>
-  <w:abstractNum w:abstractNumId="60" w15:restartNumberingAfterBreak="0">
+  <w:abstractNum w:abstractNumId="65" w15:restartNumberingAfterBreak="0">
     <w:nsid w:val="6B91724A"/>
     <w:multiLevelType w:val="multilevel"/>
     <w:tmpl w:val="9AF887B6"/>
@@ -21472,7 +23659,7 @@
       </w:rPr>
     </w:lvl>
   </w:abstractNum>
-  <w:abstractNum w:abstractNumId="61" w15:restartNumberingAfterBreak="0">
+  <w:abstractNum w:abstractNumId="66" w15:restartNumberingAfterBreak="0">
     <w:nsid w:val="6FBA70C3"/>
     <w:multiLevelType w:val="multilevel"/>
     <w:tmpl w:val="76946D5A"/>
@@ -21621,7 +23808,7 @@
       </w:rPr>
     </w:lvl>
   </w:abstractNum>
-  <w:abstractNum w:abstractNumId="62" w15:restartNumberingAfterBreak="0">
+  <w:abstractNum w:abstractNumId="67" w15:restartNumberingAfterBreak="0">
     <w:nsid w:val="71BA3BA1"/>
     <w:multiLevelType w:val="multilevel"/>
     <w:tmpl w:val="9A2AAF66"/>
@@ -21770,7 +23957,7 @@
       </w:rPr>
     </w:lvl>
   </w:abstractNum>
-  <w:abstractNum w:abstractNumId="63" w15:restartNumberingAfterBreak="0">
+  <w:abstractNum w:abstractNumId="68" w15:restartNumberingAfterBreak="0">
     <w:nsid w:val="74BE74AA"/>
     <w:multiLevelType w:val="multilevel"/>
     <w:tmpl w:val="D56069A4"/>
@@ -21883,7 +24070,156 @@
       </w:pPr>
     </w:lvl>
   </w:abstractNum>
-  <w:abstractNum w:abstractNumId="64" w15:restartNumberingAfterBreak="0">
+  <w:abstractNum w:abstractNumId="69" w15:restartNumberingAfterBreak="0">
+    <w:nsid w:val="76572DF0"/>
+    <w:multiLevelType w:val="multilevel"/>
+    <w:tmpl w:val="1114ADAA"/>
+    <w:lvl w:ilvl="0">
+      <w:start w:val="1"/>
+      <w:numFmt w:val="bullet"/>
+      <w:lvlText w:val=""/>
+      <w:lvlJc w:val="left"/>
+      <w:pPr>
+        <w:tabs>
+          <w:tab w:val="num" w:pos="720"/>
+        </w:tabs>
+        <w:ind w:left="720" w:hanging="360"/>
+      </w:pPr>
+      <w:rPr>
+        <w:rFonts w:ascii="Symbol" w:hAnsi="Symbol" w:hint="default"/>
+        <w:sz w:val="20"/>
+      </w:rPr>
+    </w:lvl>
+    <w:lvl w:ilvl="1" w:tentative="1">
+      <w:start w:val="1"/>
+      <w:numFmt w:val="bullet"/>
+      <w:lvlText w:val="o"/>
+      <w:lvlJc w:val="left"/>
+      <w:pPr>
+        <w:tabs>
+          <w:tab w:val="num" w:pos="1440"/>
+        </w:tabs>
+        <w:ind w:left="1440" w:hanging="360"/>
+      </w:pPr>
+      <w:rPr>
+        <w:rFonts w:ascii="Courier New" w:hAnsi="Courier New" w:hint="default"/>
+        <w:sz w:val="20"/>
+      </w:rPr>
+    </w:lvl>
+    <w:lvl w:ilvl="2" w:tentative="1">
+      <w:start w:val="1"/>
+      <w:numFmt w:val="bullet"/>
+      <w:lvlText w:val=""/>
+      <w:lvlJc w:val="left"/>
+      <w:pPr>
+        <w:tabs>
+          <w:tab w:val="num" w:pos="2160"/>
+        </w:tabs>
+        <w:ind w:left="2160" w:hanging="360"/>
+      </w:pPr>
+      <w:rPr>
+        <w:rFonts w:ascii="Wingdings" w:hAnsi="Wingdings" w:hint="default"/>
+        <w:sz w:val="20"/>
+      </w:rPr>
+    </w:lvl>
+    <w:lvl w:ilvl="3" w:tentative="1">
+      <w:start w:val="1"/>
+      <w:numFmt w:val="bullet"/>
+      <w:lvlText w:val=""/>
+      <w:lvlJc w:val="left"/>
+      <w:pPr>
+        <w:tabs>
+          <w:tab w:val="num" w:pos="2880"/>
+        </w:tabs>
+        <w:ind w:left="2880" w:hanging="360"/>
+      </w:pPr>
+      <w:rPr>
+        <w:rFonts w:ascii="Wingdings" w:hAnsi="Wingdings" w:hint="default"/>
+        <w:sz w:val="20"/>
+      </w:rPr>
+    </w:lvl>
+    <w:lvl w:ilvl="4" w:tentative="1">
+      <w:start w:val="1"/>
+      <w:numFmt w:val="bullet"/>
+      <w:lvlText w:val=""/>
+      <w:lvlJc w:val="left"/>
+      <w:pPr>
+        <w:tabs>
+          <w:tab w:val="num" w:pos="3600"/>
+        </w:tabs>
+        <w:ind w:left="3600" w:hanging="360"/>
+      </w:pPr>
+      <w:rPr>
+        <w:rFonts w:ascii="Wingdings" w:hAnsi="Wingdings" w:hint="default"/>
+        <w:sz w:val="20"/>
+      </w:rPr>
+    </w:lvl>
+    <w:lvl w:ilvl="5" w:tentative="1">
+      <w:start w:val="1"/>
+      <w:numFmt w:val="bullet"/>
+      <w:lvlText w:val=""/>
+      <w:lvlJc w:val="left"/>
+      <w:pPr>
+        <w:tabs>
+          <w:tab w:val="num" w:pos="4320"/>
+        </w:tabs>
+        <w:ind w:left="4320" w:hanging="360"/>
+      </w:pPr>
+      <w:rPr>
+        <w:rFonts w:ascii="Wingdings" w:hAnsi="Wingdings" w:hint="default"/>
+        <w:sz w:val="20"/>
+      </w:rPr>
+    </w:lvl>
+    <w:lvl w:ilvl="6" w:tentative="1">
+      <w:start w:val="1"/>
+      <w:numFmt w:val="bullet"/>
+      <w:lvlText w:val=""/>
+      <w:lvlJc w:val="left"/>
+      <w:pPr>
+        <w:tabs>
+          <w:tab w:val="num" w:pos="5040"/>
+        </w:tabs>
+        <w:ind w:left="5040" w:hanging="360"/>
+      </w:pPr>
+      <w:rPr>
+        <w:rFonts w:ascii="Wingdings" w:hAnsi="Wingdings" w:hint="default"/>
+        <w:sz w:val="20"/>
+      </w:rPr>
+    </w:lvl>
+    <w:lvl w:ilvl="7" w:tentative="1">
+      <w:start w:val="1"/>
+      <w:numFmt w:val="bullet"/>
+      <w:lvlText w:val=""/>
+      <w:lvlJc w:val="left"/>
+      <w:pPr>
+        <w:tabs>
+          <w:tab w:val="num" w:pos="5760"/>
+        </w:tabs>
+        <w:ind w:left="5760" w:hanging="360"/>
+      </w:pPr>
+      <w:rPr>
+        <w:rFonts w:ascii="Wingdings" w:hAnsi="Wingdings" w:hint="default"/>
+        <w:sz w:val="20"/>
+      </w:rPr>
+    </w:lvl>
+    <w:lvl w:ilvl="8" w:tentative="1">
+      <w:start w:val="1"/>
+      <w:numFmt w:val="bullet"/>
+      <w:lvlText w:val=""/>
+      <w:lvlJc w:val="left"/>
+      <w:pPr>
+        <w:tabs>
+          <w:tab w:val="num" w:pos="6480"/>
+        </w:tabs>
+        <w:ind w:left="6480" w:hanging="360"/>
+      </w:pPr>
+      <w:rPr>
+        <w:rFonts w:ascii="Wingdings" w:hAnsi="Wingdings" w:hint="default"/>
+        <w:sz w:val="20"/>
+      </w:rPr>
+    </w:lvl>
+  </w:abstractNum>
+  <w:abstractNum w:abstractNumId="70" w15:restartNumberingAfterBreak="0">
     <w:nsid w:val="76A85F3E"/>
     <w:multiLevelType w:val="multilevel"/>
     <w:tmpl w:val="1AE8BFFA"/>
@@ -21996,7 +24332,7 @@
       </w:pPr>
     </w:lvl>
   </w:abstractNum>
-  <w:abstractNum w:abstractNumId="65" w15:restartNumberingAfterBreak="0">
+  <w:abstractNum w:abstractNumId="71" w15:restartNumberingAfterBreak="0">
     <w:nsid w:val="78727440"/>
     <w:multiLevelType w:val="multilevel"/>
     <w:tmpl w:val="1494F212"/>
@@ -22145,7 +24481,7 @@
       </w:rPr>
     </w:lvl>
   </w:abstractNum>
-  <w:abstractNum w:abstractNumId="66" w15:restartNumberingAfterBreak="0">
+  <w:abstractNum w:abstractNumId="72" w15:restartNumberingAfterBreak="0">
     <w:nsid w:val="78E244CA"/>
     <w:multiLevelType w:val="multilevel"/>
     <w:tmpl w:val="5E86C51C"/>
@@ -22294,206 +24630,376 @@
       </w:rPr>
     </w:lvl>
   </w:abstractNum>
+  <w:abstractNum w:abstractNumId="73" w15:restartNumberingAfterBreak="0">
+    <w:nsid w:val="7BBB1ABD"/>
+    <w:multiLevelType w:val="multilevel"/>
+    <w:tmpl w:val="F304696A"/>
+    <w:lvl w:ilvl="0">
+      <w:start w:val="1"/>
+      <w:numFmt w:val="bullet"/>
+      <w:lvlText w:val=""/>
+      <w:lvlJc w:val="left"/>
+      <w:pPr>
+        <w:tabs>
+          <w:tab w:val="num" w:pos="720"/>
+        </w:tabs>
+        <w:ind w:left="720" w:hanging="360"/>
+      </w:pPr>
+      <w:rPr>
+        <w:rFonts w:ascii="Symbol" w:hAnsi="Symbol" w:hint="default"/>
+        <w:sz w:val="20"/>
+      </w:rPr>
+    </w:lvl>
+    <w:lvl w:ilvl="1" w:tentative="1">
+      <w:start w:val="1"/>
+      <w:numFmt w:val="bullet"/>
+      <w:lvlText w:val="o"/>
+      <w:lvlJc w:val="left"/>
+      <w:pPr>
+        <w:tabs>
+          <w:tab w:val="num" w:pos="1440"/>
+        </w:tabs>
+        <w:ind w:left="1440" w:hanging="360"/>
+      </w:pPr>
+      <w:rPr>
+        <w:rFonts w:ascii="Courier New" w:hAnsi="Courier New" w:hint="default"/>
+        <w:sz w:val="20"/>
+      </w:rPr>
+    </w:lvl>
+    <w:lvl w:ilvl="2" w:tentative="1">
+      <w:start w:val="1"/>
+      <w:numFmt w:val="bullet"/>
+      <w:lvlText w:val=""/>
+      <w:lvlJc w:val="left"/>
+      <w:pPr>
+        <w:tabs>
+          <w:tab w:val="num" w:pos="2160"/>
+        </w:tabs>
+        <w:ind w:left="2160" w:hanging="360"/>
+      </w:pPr>
+      <w:rPr>
+        <w:rFonts w:ascii="Wingdings" w:hAnsi="Wingdings" w:hint="default"/>
+        <w:sz w:val="20"/>
+      </w:rPr>
+    </w:lvl>
+    <w:lvl w:ilvl="3" w:tentative="1">
+      <w:start w:val="1"/>
+      <w:numFmt w:val="bullet"/>
+      <w:lvlText w:val=""/>
+      <w:lvlJc w:val="left"/>
+      <w:pPr>
+        <w:tabs>
+          <w:tab w:val="num" w:pos="2880"/>
+        </w:tabs>
+        <w:ind w:left="2880" w:hanging="360"/>
+      </w:pPr>
+      <w:rPr>
+        <w:rFonts w:ascii="Wingdings" w:hAnsi="Wingdings" w:hint="default"/>
+        <w:sz w:val="20"/>
+      </w:rPr>
+    </w:lvl>
+    <w:lvl w:ilvl="4" w:tentative="1">
+      <w:start w:val="1"/>
+      <w:numFmt w:val="bullet"/>
+      <w:lvlText w:val=""/>
+      <w:lvlJc w:val="left"/>
+      <w:pPr>
+        <w:tabs>
+          <w:tab w:val="num" w:pos="3600"/>
+        </w:tabs>
+        <w:ind w:left="3600" w:hanging="360"/>
+      </w:pPr>
+      <w:rPr>
+        <w:rFonts w:ascii="Wingdings" w:hAnsi="Wingdings" w:hint="default"/>
+        <w:sz w:val="20"/>
+      </w:rPr>
+    </w:lvl>
+    <w:lvl w:ilvl="5" w:tentative="1">
+      <w:start w:val="1"/>
+      <w:numFmt w:val="bullet"/>
+      <w:lvlText w:val=""/>
+      <w:lvlJc w:val="left"/>
+      <w:pPr>
+        <w:tabs>
+          <w:tab w:val="num" w:pos="4320"/>
+        </w:tabs>
+        <w:ind w:left="4320" w:hanging="360"/>
+      </w:pPr>
+      <w:rPr>
+        <w:rFonts w:ascii="Wingdings" w:hAnsi="Wingdings" w:hint="default"/>
+        <w:sz w:val="20"/>
+      </w:rPr>
+    </w:lvl>
+    <w:lvl w:ilvl="6" w:tentative="1">
+      <w:start w:val="1"/>
+      <w:numFmt w:val="bullet"/>
+      <w:lvlText w:val=""/>
+      <w:lvlJc w:val="left"/>
+      <w:pPr>
+        <w:tabs>
+          <w:tab w:val="num" w:pos="5040"/>
+        </w:tabs>
+        <w:ind w:left="5040" w:hanging="360"/>
+      </w:pPr>
+      <w:rPr>
+        <w:rFonts w:ascii="Wingdings" w:hAnsi="Wingdings" w:hint="default"/>
+        <w:sz w:val="20"/>
+      </w:rPr>
+    </w:lvl>
+    <w:lvl w:ilvl="7" w:tentative="1">
+      <w:start w:val="1"/>
+      <w:numFmt w:val="bullet"/>
+      <w:lvlText w:val=""/>
+      <w:lvlJc w:val="left"/>
+      <w:pPr>
+        <w:tabs>
+          <w:tab w:val="num" w:pos="5760"/>
+        </w:tabs>
+        <w:ind w:left="5760" w:hanging="360"/>
+      </w:pPr>
+      <w:rPr>
+        <w:rFonts w:ascii="Wingdings" w:hAnsi="Wingdings" w:hint="default"/>
+        <w:sz w:val="20"/>
+      </w:rPr>
+    </w:lvl>
+    <w:lvl w:ilvl="8" w:tentative="1">
+      <w:start w:val="1"/>
+      <w:numFmt w:val="bullet"/>
+      <w:lvlText w:val=""/>
+      <w:lvlJc w:val="left"/>
+      <w:pPr>
+        <w:tabs>
+          <w:tab w:val="num" w:pos="6480"/>
+        </w:tabs>
+        <w:ind w:left="6480" w:hanging="360"/>
+      </w:pPr>
+      <w:rPr>
+        <w:rFonts w:ascii="Wingdings" w:hAnsi="Wingdings" w:hint="default"/>
+        <w:sz w:val="20"/>
+      </w:rPr>
+    </w:lvl>
+  </w:abstractNum>
   <w:num w:numId="1" w16cid:durableId="1627278673">
-    <w:abstractNumId w:val="16"/>
+    <w:abstractNumId w:val="17"/>
   </w:num>
   <w:num w:numId="2" w16cid:durableId="1413819726">
-    <w:abstractNumId w:val="56"/>
+    <w:abstractNumId w:val="61"/>
   </w:num>
   <w:num w:numId="3" w16cid:durableId="767232482">
+    <w:abstractNumId w:val="55"/>
+  </w:num>
+  <w:num w:numId="4" w16cid:durableId="704139301">
     <w:abstractNumId w:val="50"/>
   </w:num>
-  <w:num w:numId="4" w16cid:durableId="704139301">
-    <w:abstractNumId w:val="45"/>
-  </w:num>
   <w:num w:numId="5" w16cid:durableId="734428441">
-    <w:abstractNumId w:val="63"/>
+    <w:abstractNumId w:val="68"/>
   </w:num>
   <w:num w:numId="6" w16cid:durableId="1002202605">
-    <w:abstractNumId w:val="61"/>
+    <w:abstractNumId w:val="66"/>
   </w:num>
   <w:num w:numId="7" w16cid:durableId="2073656980">
-    <w:abstractNumId w:val="26"/>
+    <w:abstractNumId w:val="30"/>
   </w:num>
   <w:num w:numId="8" w16cid:durableId="1345671324">
-    <w:abstractNumId w:val="38"/>
+    <w:abstractNumId w:val="43"/>
   </w:num>
   <w:num w:numId="9" w16cid:durableId="394474592">
-    <w:abstractNumId w:val="59"/>
+    <w:abstractNumId w:val="64"/>
   </w:num>
   <w:num w:numId="10" w16cid:durableId="1602494615">
     <w:abstractNumId w:val="2"/>
   </w:num>
   <w:num w:numId="11" w16cid:durableId="411777275">
-    <w:abstractNumId w:val="3"/>
+    <w:abstractNumId w:val="4"/>
   </w:num>
   <w:num w:numId="12" w16cid:durableId="381103826">
+    <w:abstractNumId w:val="21"/>
+  </w:num>
+  <w:num w:numId="13" w16cid:durableId="490826871">
+    <w:abstractNumId w:val="48"/>
+  </w:num>
+  <w:num w:numId="14" w16cid:durableId="1918980509">
+    <w:abstractNumId w:val="53"/>
+  </w:num>
+  <w:num w:numId="15" w16cid:durableId="1639413033">
+    <w:abstractNumId w:val="35"/>
+  </w:num>
+  <w:num w:numId="16" w16cid:durableId="1208645567">
+    <w:abstractNumId w:val="59"/>
+  </w:num>
+  <w:num w:numId="17" w16cid:durableId="236327851">
     <w:abstractNumId w:val="19"/>
   </w:num>
-  <w:num w:numId="13" w16cid:durableId="490826871">
-    <w:abstractNumId w:val="43"/>
-  </w:num>
-  <w:num w:numId="14" w16cid:durableId="1918980509">
-    <w:abstractNumId w:val="48"/>
-  </w:num>
-  <w:num w:numId="15" w16cid:durableId="1639413033">
-    <w:abstractNumId w:val="30"/>
-  </w:num>
-  <w:num w:numId="16" w16cid:durableId="1208645567">
-    <w:abstractNumId w:val="54"/>
-  </w:num>
-  <w:num w:numId="17" w16cid:durableId="236327851">
-    <w:abstractNumId w:val="17"/>
-  </w:num>
   <w:num w:numId="18" w16cid:durableId="1494642012">
-    <w:abstractNumId w:val="28"/>
+    <w:abstractNumId w:val="33"/>
   </w:num>
   <w:num w:numId="19" w16cid:durableId="1558128661">
-    <w:abstractNumId w:val="60"/>
+    <w:abstractNumId w:val="65"/>
   </w:num>
   <w:num w:numId="20" w16cid:durableId="669716839">
+    <w:abstractNumId w:val="62"/>
+  </w:num>
+  <w:num w:numId="21" w16cid:durableId="350689850">
+    <w:abstractNumId w:val="40"/>
+  </w:num>
+  <w:num w:numId="22" w16cid:durableId="399058244">
+    <w:abstractNumId w:val="42"/>
+  </w:num>
+  <w:num w:numId="23" w16cid:durableId="766467579">
+    <w:abstractNumId w:val="45"/>
+  </w:num>
+  <w:num w:numId="24" w16cid:durableId="489103804">
+    <w:abstractNumId w:val="23"/>
+  </w:num>
+  <w:num w:numId="25" w16cid:durableId="1093668450">
+    <w:abstractNumId w:val="46"/>
+  </w:num>
+  <w:num w:numId="26" w16cid:durableId="373820642">
+    <w:abstractNumId w:val="71"/>
+  </w:num>
+  <w:num w:numId="27" w16cid:durableId="476342869">
+    <w:abstractNumId w:val="52"/>
+  </w:num>
+  <w:num w:numId="28" w16cid:durableId="939753102">
+    <w:abstractNumId w:val="12"/>
+  </w:num>
+  <w:num w:numId="29" w16cid:durableId="1067145134">
+    <w:abstractNumId w:val="37"/>
+  </w:num>
+  <w:num w:numId="30" w16cid:durableId="1664619586">
+    <w:abstractNumId w:val="63"/>
+  </w:num>
+  <w:num w:numId="31" w16cid:durableId="1217357972">
     <w:abstractNumId w:val="57"/>
   </w:num>
-  <w:num w:numId="21" w16cid:durableId="350689850">
-    <w:abstractNumId w:val="35"/>
-  </w:num>
-  <w:num w:numId="22" w16cid:durableId="399058244">
-    <w:abstractNumId w:val="37"/>
-  </w:num>
-  <w:num w:numId="23" w16cid:durableId="766467579">
-    <w:abstractNumId w:val="40"/>
-  </w:num>
-  <w:num w:numId="24" w16cid:durableId="489103804">
-    <w:abstractNumId w:val="21"/>
-  </w:num>
-  <w:num w:numId="25" w16cid:durableId="1093668450">
-    <w:abstractNumId w:val="41"/>
-  </w:num>
-  <w:num w:numId="26" w16cid:durableId="373820642">
-    <w:abstractNumId w:val="65"/>
-  </w:num>
-  <w:num w:numId="27" w16cid:durableId="476342869">
-    <w:abstractNumId w:val="47"/>
-  </w:num>
-  <w:num w:numId="28" w16cid:durableId="939753102">
-    <w:abstractNumId w:val="11"/>
-  </w:num>
-  <w:num w:numId="29" w16cid:durableId="1067145134">
-    <w:abstractNumId w:val="32"/>
-  </w:num>
-  <w:num w:numId="30" w16cid:durableId="1664619586">
-    <w:abstractNumId w:val="58"/>
-  </w:num>
-  <w:num w:numId="31" w16cid:durableId="1217357972">
-    <w:abstractNumId w:val="52"/>
-  </w:num>
   <w:num w:numId="32" w16cid:durableId="1138299373">
-    <w:abstractNumId w:val="33"/>
+    <w:abstractNumId w:val="38"/>
   </w:num>
   <w:num w:numId="33" w16cid:durableId="1937515265">
-    <w:abstractNumId w:val="39"/>
+    <w:abstractNumId w:val="44"/>
   </w:num>
   <w:num w:numId="34" w16cid:durableId="2039045055">
-    <w:abstractNumId w:val="12"/>
+    <w:abstractNumId w:val="13"/>
   </w:num>
   <w:num w:numId="35" w16cid:durableId="307825311">
     <w:abstractNumId w:val="0"/>
   </w:num>
   <w:num w:numId="36" w16cid:durableId="989752758">
+    <w:abstractNumId w:val="16"/>
+  </w:num>
+  <w:num w:numId="37" w16cid:durableId="1848788530">
     <w:abstractNumId w:val="15"/>
   </w:num>
-  <w:num w:numId="37" w16cid:durableId="1848788530">
-    <w:abstractNumId w:val="14"/>
-  </w:num>
   <w:num w:numId="38" w16cid:durableId="940988078">
-    <w:abstractNumId w:val="27"/>
+    <w:abstractNumId w:val="32"/>
   </w:num>
   <w:num w:numId="39" w16cid:durableId="960038298">
     <w:abstractNumId w:val="1"/>
   </w:num>
   <w:num w:numId="40" w16cid:durableId="1342243794">
+    <w:abstractNumId w:val="8"/>
+  </w:num>
+  <w:num w:numId="41" w16cid:durableId="1952976539">
+    <w:abstractNumId w:val="29"/>
+  </w:num>
+  <w:num w:numId="42" w16cid:durableId="657852460">
+    <w:abstractNumId w:val="67"/>
+  </w:num>
+  <w:num w:numId="43" w16cid:durableId="1041706726">
+    <w:abstractNumId w:val="27"/>
+  </w:num>
+  <w:num w:numId="44" w16cid:durableId="172843208">
+    <w:abstractNumId w:val="49"/>
+  </w:num>
+  <w:num w:numId="45" w16cid:durableId="1073743015">
+    <w:abstractNumId w:val="34"/>
+  </w:num>
+  <w:num w:numId="46" w16cid:durableId="2064015667">
+    <w:abstractNumId w:val="22"/>
+  </w:num>
+  <w:num w:numId="47" w16cid:durableId="1499881813">
+    <w:abstractNumId w:val="60"/>
+  </w:num>
+  <w:num w:numId="48" w16cid:durableId="924461925">
+    <w:abstractNumId w:val="41"/>
+  </w:num>
+  <w:num w:numId="49" w16cid:durableId="1853379156">
+    <w:abstractNumId w:val="5"/>
+  </w:num>
+  <w:num w:numId="50" w16cid:durableId="2003847214">
+    <w:abstractNumId w:val="9"/>
+  </w:num>
+  <w:num w:numId="51" w16cid:durableId="691687696">
+    <w:abstractNumId w:val="36"/>
+  </w:num>
+  <w:num w:numId="52" w16cid:durableId="202793163">
     <w:abstractNumId w:val="7"/>
   </w:num>
-  <w:num w:numId="41" w16cid:durableId="1952976539">
+  <w:num w:numId="53" w16cid:durableId="1088965478">
+    <w:abstractNumId w:val="14"/>
+  </w:num>
+  <w:num w:numId="54" w16cid:durableId="409816935">
+    <w:abstractNumId w:val="39"/>
+  </w:num>
+  <w:num w:numId="55" w16cid:durableId="466630412">
+    <w:abstractNumId w:val="51"/>
+  </w:num>
+  <w:num w:numId="56" w16cid:durableId="64227954">
+    <w:abstractNumId w:val="6"/>
+  </w:num>
+  <w:num w:numId="57" w16cid:durableId="1544051128">
+    <w:abstractNumId w:val="47"/>
+  </w:num>
+  <w:num w:numId="58" w16cid:durableId="1944919879">
+    <w:abstractNumId w:val="24"/>
+  </w:num>
+  <w:num w:numId="59" w16cid:durableId="1570267216">
+    <w:abstractNumId w:val="20"/>
+  </w:num>
+  <w:num w:numId="60" w16cid:durableId="1061291552">
+    <w:abstractNumId w:val="11"/>
+  </w:num>
+  <w:num w:numId="61" w16cid:durableId="1569463838">
+    <w:abstractNumId w:val="28"/>
+  </w:num>
+  <w:num w:numId="62" w16cid:durableId="788857854">
+    <w:abstractNumId w:val="10"/>
+  </w:num>
+  <w:num w:numId="63" w16cid:durableId="1678460317">
+    <w:abstractNumId w:val="56"/>
+  </w:num>
+  <w:num w:numId="64" w16cid:durableId="638607692">
+    <w:abstractNumId w:val="72"/>
+  </w:num>
+  <w:num w:numId="65" w16cid:durableId="293103421">
+    <w:abstractNumId w:val="54"/>
+  </w:num>
+  <w:num w:numId="66" w16cid:durableId="2022659437">
+    <w:abstractNumId w:val="58"/>
+  </w:num>
+  <w:num w:numId="67" w16cid:durableId="848252097">
+    <w:abstractNumId w:val="70"/>
+  </w:num>
+  <w:num w:numId="68" w16cid:durableId="713576156">
+    <w:abstractNumId w:val="26"/>
+  </w:num>
+  <w:num w:numId="69" w16cid:durableId="1412577807">
+    <w:abstractNumId w:val="3"/>
+  </w:num>
+  <w:num w:numId="70" w16cid:durableId="1515651761">
     <w:abstractNumId w:val="25"/>
   </w:num>
-  <w:num w:numId="42" w16cid:durableId="657852460">
-    <w:abstractNumId w:val="62"/>
+  <w:num w:numId="71" w16cid:durableId="2099211811">
+    <w:abstractNumId w:val="69"/>
   </w:num>
-  <w:num w:numId="43" w16cid:durableId="1041706726">
-    <w:abstractNumId w:val="23"/>
+  <w:num w:numId="72" w16cid:durableId="1016073801">
+    <w:abstractNumId w:val="73"/>
   </w:num>
-  <w:num w:numId="44" w16cid:durableId="172843208">
-    <w:abstractNumId w:val="44"/>
-  </w:num>
-  <w:num w:numId="45" w16cid:durableId="1073743015">
-    <w:abstractNumId w:val="29"/>
-  </w:num>
-  <w:num w:numId="46" w16cid:durableId="2064015667">
-    <w:abstractNumId w:val="20"/>
-  </w:num>
-  <w:num w:numId="47" w16cid:durableId="1499881813">
-    <w:abstractNumId w:val="55"/>
-  </w:num>
-  <w:num w:numId="48" w16cid:durableId="924461925">
-    <w:abstractNumId w:val="36"/>
-  </w:num>
-  <w:num w:numId="49" w16cid:durableId="1853379156">
-    <w:abstractNumId w:val="4"/>
-  </w:num>
-  <w:num w:numId="50" w16cid:durableId="2003847214">
-    <w:abstractNumId w:val="8"/>
-  </w:num>
-  <w:num w:numId="51" w16cid:durableId="691687696">
-    <w:abstractNumId w:val="31"/>
-  </w:num>
-  <w:num w:numId="52" w16cid:durableId="202793163">
-    <w:abstractNumId w:val="6"/>
-  </w:num>
-  <w:num w:numId="53" w16cid:durableId="1088965478">
-    <w:abstractNumId w:val="13"/>
-  </w:num>
-  <w:num w:numId="54" w16cid:durableId="409816935">
-    <w:abstractNumId w:val="34"/>
-  </w:num>
-  <w:num w:numId="55" w16cid:durableId="466630412">
-    <w:abstractNumId w:val="46"/>
-  </w:num>
-  <w:num w:numId="56" w16cid:durableId="64227954">
-    <w:abstractNumId w:val="5"/>
-  </w:num>
-  <w:num w:numId="57" w16cid:durableId="1544051128">
-    <w:abstractNumId w:val="42"/>
-  </w:num>
-  <w:num w:numId="58" w16cid:durableId="1944919879">
-    <w:abstractNumId w:val="22"/>
-  </w:num>
-  <w:num w:numId="59" w16cid:durableId="1570267216">
+  <w:num w:numId="73" w16cid:durableId="516894393">
     <w:abstractNumId w:val="18"/>
   </w:num>
-  <w:num w:numId="60" w16cid:durableId="1061291552">
-    <w:abstractNumId w:val="10"/>
-  </w:num>
-  <w:num w:numId="61" w16cid:durableId="1569463838">
-    <w:abstractNumId w:val="24"/>
-  </w:num>
-  <w:num w:numId="62" w16cid:durableId="788857854">
-    <w:abstractNumId w:val="9"/>
-  </w:num>
-  <w:num w:numId="63" w16cid:durableId="1678460317">
-    <w:abstractNumId w:val="51"/>
-  </w:num>
-  <w:num w:numId="64" w16cid:durableId="638607692">
-    <w:abstractNumId w:val="66"/>
-  </w:num>
-  <w:num w:numId="65" w16cid:durableId="293103421">
-    <w:abstractNumId w:val="49"/>
-  </w:num>
-  <w:num w:numId="66" w16cid:durableId="2022659437">
-    <w:abstractNumId w:val="53"/>
-  </w:num>
-  <w:num w:numId="67" w16cid:durableId="848252097">
-    <w:abstractNumId w:val="64"/>
+  <w:num w:numId="74" w16cid:durableId="1132745838">
+    <w:abstractNumId w:val="31"/>
   </w:num>
   <w:numIdMacAtCleanup w:val="67"/>
 </w:numbering>

</xml_diff>